<commit_message>
reuploaded main hehe sorry
</commit_message>
<xml_diff>
--- a/MCO2-Documentation-18.docx
+++ b/MCO2-Documentation-18.docx
@@ -120,7 +120,27 @@
                 <w:sz w:val="20"/>
                 <w:szCs w:val="20"/>
               </w:rPr>
-              <w:t>We declare that the project we are submitting is the product of our own work augmented with responsible and ethical use of generative AI as encoded in Table 1  and Table 2 below.</w:t>
+              <w:t xml:space="preserve">We declare that the project we are submitting is the product of our own work augmented with responsible and ethical use of generative AI as encoded in Table </w:t>
+            </w:r>
+            <w:proofErr w:type="gramStart"/>
+            <w:r>
+              <w:rPr>
+                <w:i/>
+                <w:iCs/>
+                <w:sz w:val="20"/>
+                <w:szCs w:val="20"/>
+              </w:rPr>
+              <w:t>1  and</w:t>
+            </w:r>
+            <w:proofErr w:type="gramEnd"/>
+            <w:r>
+              <w:rPr>
+                <w:i/>
+                <w:iCs/>
+                <w:sz w:val="20"/>
+                <w:szCs w:val="20"/>
+              </w:rPr>
+              <w:t xml:space="preserve"> Table 2 below.</w:t>
             </w:r>
           </w:p>
           <w:p>
@@ -322,7 +342,29 @@
                 <w:sz w:val="20"/>
                 <w:szCs w:val="20"/>
               </w:rPr>
-              <w:t>// Instruction #1: Encode your names, and affix your e-signature to attest to the declaration above.</w:t>
+              <w:t xml:space="preserve">// Instruction #1: Encode your </w:t>
+            </w:r>
+            <w:proofErr w:type="gramStart"/>
+            <w:r>
+              <w:rPr>
+                <w:b/>
+                <w:bCs/>
+                <w:color w:val="999999"/>
+                <w:sz w:val="20"/>
+                <w:szCs w:val="20"/>
+              </w:rPr>
+              <w:t>names, and</w:t>
+            </w:r>
+            <w:proofErr w:type="gramEnd"/>
+            <w:r>
+              <w:rPr>
+                <w:b/>
+                <w:bCs/>
+                <w:color w:val="999999"/>
+                <w:sz w:val="20"/>
+                <w:szCs w:val="20"/>
+              </w:rPr>
+              <w:t xml:space="preserve"> affix your e-signature to attest to the declaration above.</w:t>
             </w:r>
           </w:p>
           <w:p>
@@ -588,7 +630,29 @@
           <w:sz w:val="20"/>
           <w:szCs w:val="20"/>
         </w:rPr>
-        <w:t>// Instruction #2: Fill-up the column 2 of Table 1 below.</w:t>
+        <w:t xml:space="preserve">// Instruction #2: Fill-up </w:t>
+      </w:r>
+      <w:proofErr w:type="gramStart"/>
+      <w:r>
+        <w:rPr>
+          <w:b/>
+          <w:bCs/>
+          <w:color w:val="999999"/>
+          <w:sz w:val="20"/>
+          <w:szCs w:val="20"/>
+        </w:rPr>
+        <w:t>the column</w:t>
+      </w:r>
+      <w:proofErr w:type="gramEnd"/>
+      <w:r>
+        <w:rPr>
+          <w:b/>
+          <w:bCs/>
+          <w:color w:val="999999"/>
+          <w:sz w:val="20"/>
+          <w:szCs w:val="20"/>
+        </w:rPr>
+        <w:t xml:space="preserve"> 2 of Table 1 below.</w:t>
       </w:r>
     </w:p>
     <w:p>
@@ -1294,7 +1358,31 @@
                 <w:szCs w:val="20"/>
                 <w:highlight w:val="yellow"/>
               </w:rPr>
-              <w:t>All test cases were made by human, debugging was also done manually by human only</w:t>
+              <w:t xml:space="preserve">All test cases were made by </w:t>
+            </w:r>
+            <w:proofErr w:type="gramStart"/>
+            <w:r>
+              <w:rPr>
+                <w:i/>
+                <w:iCs/>
+                <w:color w:val="0000FF"/>
+                <w:sz w:val="20"/>
+                <w:szCs w:val="20"/>
+                <w:highlight w:val="yellow"/>
+              </w:rPr>
+              <w:t>human,</w:t>
+            </w:r>
+            <w:proofErr w:type="gramEnd"/>
+            <w:r>
+              <w:rPr>
+                <w:i/>
+                <w:iCs/>
+                <w:color w:val="0000FF"/>
+                <w:sz w:val="20"/>
+                <w:szCs w:val="20"/>
+                <w:highlight w:val="yellow"/>
+              </w:rPr>
+              <w:t xml:space="preserve"> debugging was also done manually by human only</w:t>
             </w:r>
             <w:r>
               <w:rPr>
@@ -1431,7 +1519,29 @@
           <w:sz w:val="20"/>
           <w:szCs w:val="20"/>
         </w:rPr>
-        <w:t>// Instruction #3: Fill up Table 2. List explicitly ALL AI tools that you employed, and justify their purpose/role in your project.</w:t>
+        <w:t xml:space="preserve">// Instruction #3: Fill up Table 2. List explicitly ALL AI tools that you </w:t>
+      </w:r>
+      <w:proofErr w:type="gramStart"/>
+      <w:r>
+        <w:rPr>
+          <w:b/>
+          <w:bCs/>
+          <w:color w:val="999999"/>
+          <w:sz w:val="20"/>
+          <w:szCs w:val="20"/>
+        </w:rPr>
+        <w:t>employed, and</w:t>
+      </w:r>
+      <w:proofErr w:type="gramEnd"/>
+      <w:r>
+        <w:rPr>
+          <w:b/>
+          <w:bCs/>
+          <w:color w:val="999999"/>
+          <w:sz w:val="20"/>
+          <w:szCs w:val="20"/>
+        </w:rPr>
+        <w:t xml:space="preserve"> justify their purpose/role in your project.</w:t>
       </w:r>
     </w:p>
     <w:p>
@@ -1465,7 +1575,27 @@
           <w:sz w:val="20"/>
           <w:szCs w:val="20"/>
         </w:rPr>
-        <w:t>Table 2. List of AI Tools Used</w:t>
+        <w:t xml:space="preserve">Table 2. List of </w:t>
+      </w:r>
+      <w:proofErr w:type="gramStart"/>
+      <w:r>
+        <w:rPr>
+          <w:b/>
+          <w:bCs/>
+          <w:sz w:val="20"/>
+          <w:szCs w:val="20"/>
+        </w:rPr>
+        <w:t>AI</w:t>
+      </w:r>
+      <w:proofErr w:type="gramEnd"/>
+      <w:r>
+        <w:rPr>
+          <w:b/>
+          <w:bCs/>
+          <w:sz w:val="20"/>
+          <w:szCs w:val="20"/>
+        </w:rPr>
+        <w:t xml:space="preserve"> Tools Used</w:t>
       </w:r>
     </w:p>
     <w:tbl>
@@ -1939,7 +2069,27 @@
                 <w:szCs w:val="20"/>
                 <w:highlight w:val="yellow"/>
               </w:rPr>
-              <w:t>Encode details of your contributions for each task. Indicate your role, for example, were you the project manager, were you the (lead) programmer for a certain module, were you the (black box) tester for a certain module, which part of the documentation were you responsible for? etc… Encode NONE if you did not contribute to a particular task.</w:t>
+              <w:t xml:space="preserve">Encode details of your contributions for each task. Indicate your role, for example, were you the project manager, were you the (lead) programmer for a certain module, were you the (black box) tester for a certain module, which part of the documentation were you responsible for? </w:t>
+            </w:r>
+            <w:proofErr w:type="spellStart"/>
+            <w:r>
+              <w:rPr>
+                <w:color w:val="0000FF"/>
+                <w:sz w:val="20"/>
+                <w:szCs w:val="20"/>
+                <w:highlight w:val="yellow"/>
+              </w:rPr>
+              <w:t>etc</w:t>
+            </w:r>
+            <w:proofErr w:type="spellEnd"/>
+            <w:r>
+              <w:rPr>
+                <w:color w:val="0000FF"/>
+                <w:sz w:val="20"/>
+                <w:szCs w:val="20"/>
+                <w:highlight w:val="yellow"/>
+              </w:rPr>
+              <w:t>… Encode NONE if you did not contribute to a particular task.</w:t>
             </w:r>
           </w:p>
           <w:p>
@@ -2001,14 +2151,45 @@
               </w:rPr>
               <w:t xml:space="preserve">, and provided the data structures, </w:t>
             </w:r>
-            <w:r>
-              <w:rPr>
-                <w:color w:val="0000FF"/>
-                <w:sz w:val="20"/>
-                <w:szCs w:val="20"/>
-                <w:highlight w:val="yellow"/>
-              </w:rPr>
-              <w:t xml:space="preserve">dataStruct.c and traversal.c </w:t>
+            <w:proofErr w:type="spellStart"/>
+            <w:r>
+              <w:rPr>
+                <w:color w:val="0000FF"/>
+                <w:sz w:val="20"/>
+                <w:szCs w:val="20"/>
+                <w:highlight w:val="yellow"/>
+              </w:rPr>
+              <w:t>dataStruct.c</w:t>
+            </w:r>
+            <w:proofErr w:type="spellEnd"/>
+            <w:r>
+              <w:rPr>
+                <w:color w:val="0000FF"/>
+                <w:sz w:val="20"/>
+                <w:szCs w:val="20"/>
+                <w:highlight w:val="yellow"/>
+              </w:rPr>
+              <w:t xml:space="preserve"> and </w:t>
+            </w:r>
+            <w:proofErr w:type="spellStart"/>
+            <w:r>
+              <w:rPr>
+                <w:color w:val="0000FF"/>
+                <w:sz w:val="20"/>
+                <w:szCs w:val="20"/>
+                <w:highlight w:val="yellow"/>
+              </w:rPr>
+              <w:t>traversal.c</w:t>
+            </w:r>
+            <w:proofErr w:type="spellEnd"/>
+            <w:r>
+              <w:rPr>
+                <w:color w:val="0000FF"/>
+                <w:sz w:val="20"/>
+                <w:szCs w:val="20"/>
+                <w:highlight w:val="yellow"/>
+              </w:rPr>
+              <w:t xml:space="preserve"> </w:t>
             </w:r>
             <w:r>
               <w:rPr>
@@ -2103,24 +2284,88 @@
               </w:rPr>
               <w:t xml:space="preserve"> Created the BFS and DFS traversal algorithms, completed </w:t>
             </w:r>
-            <w:r>
-              <w:rPr>
-                <w:color w:val="0000FF"/>
-                <w:sz w:val="20"/>
-                <w:szCs w:val="20"/>
-                <w:highlight w:val="yellow"/>
-              </w:rPr>
-              <w:t>dataStruct.c and traversal.c</w:t>
-            </w:r>
-            <w:r>
-              <w:rPr>
-                <w:color w:val="0000FF"/>
-                <w:sz w:val="20"/>
-                <w:szCs w:val="20"/>
-                <w:highlight w:val="yellow"/>
-              </w:rPr>
-              <w:t>. Completed documentation for dataStruct.c and traversal.c</w:t>
-            </w:r>
+            <w:proofErr w:type="spellStart"/>
+            <w:r>
+              <w:rPr>
+                <w:color w:val="0000FF"/>
+                <w:sz w:val="20"/>
+                <w:szCs w:val="20"/>
+                <w:highlight w:val="yellow"/>
+              </w:rPr>
+              <w:t>dataStruct.c</w:t>
+            </w:r>
+            <w:proofErr w:type="spellEnd"/>
+            <w:r>
+              <w:rPr>
+                <w:color w:val="0000FF"/>
+                <w:sz w:val="20"/>
+                <w:szCs w:val="20"/>
+                <w:highlight w:val="yellow"/>
+              </w:rPr>
+              <w:t xml:space="preserve"> and </w:t>
+            </w:r>
+            <w:proofErr w:type="spellStart"/>
+            <w:r>
+              <w:rPr>
+                <w:color w:val="0000FF"/>
+                <w:sz w:val="20"/>
+                <w:szCs w:val="20"/>
+                <w:highlight w:val="yellow"/>
+              </w:rPr>
+              <w:t>traversal.c</w:t>
+            </w:r>
+            <w:proofErr w:type="spellEnd"/>
+            <w:r>
+              <w:rPr>
+                <w:color w:val="0000FF"/>
+                <w:sz w:val="20"/>
+                <w:szCs w:val="20"/>
+                <w:highlight w:val="yellow"/>
+              </w:rPr>
+              <w:t xml:space="preserve">. Completed documentation for </w:t>
+            </w:r>
+            <w:proofErr w:type="spellStart"/>
+            <w:r>
+              <w:rPr>
+                <w:color w:val="0000FF"/>
+                <w:sz w:val="20"/>
+                <w:szCs w:val="20"/>
+                <w:highlight w:val="yellow"/>
+              </w:rPr>
+              <w:t>dataStruct.c</w:t>
+            </w:r>
+            <w:proofErr w:type="spellEnd"/>
+            <w:r>
+              <w:rPr>
+                <w:color w:val="0000FF"/>
+                <w:sz w:val="20"/>
+                <w:szCs w:val="20"/>
+                <w:highlight w:val="yellow"/>
+              </w:rPr>
+              <w:t xml:space="preserve"> and </w:t>
+            </w:r>
+            <w:proofErr w:type="spellStart"/>
+            <w:proofErr w:type="gramStart"/>
+            <w:r>
+              <w:rPr>
+                <w:color w:val="0000FF"/>
+                <w:sz w:val="20"/>
+                <w:szCs w:val="20"/>
+                <w:highlight w:val="yellow"/>
+              </w:rPr>
+              <w:t>traversal</w:t>
+            </w:r>
+            <w:proofErr w:type="gramEnd"/>
+            <w:r>
+              <w:rPr>
+                <w:color w:val="0000FF"/>
+                <w:sz w:val="20"/>
+                <w:szCs w:val="20"/>
+                <w:highlight w:val="yellow"/>
+              </w:rPr>
+              <w:t>.c</w:t>
+            </w:r>
+            <w:proofErr w:type="spellEnd"/>
           </w:p>
           <w:p>
             <w:pPr>
@@ -2398,7 +2643,27 @@
                 <w:szCs w:val="20"/>
                 <w:highlight w:val="yellow"/>
               </w:rPr>
-              <w:t>Completed documentation for graph.c and tested it.</w:t>
+              <w:t xml:space="preserve">Completed documentation for </w:t>
+            </w:r>
+            <w:proofErr w:type="spellStart"/>
+            <w:r>
+              <w:rPr>
+                <w:color w:val="0000FF"/>
+                <w:sz w:val="20"/>
+                <w:szCs w:val="20"/>
+                <w:highlight w:val="yellow"/>
+              </w:rPr>
+              <w:t>graph.c</w:t>
+            </w:r>
+            <w:proofErr w:type="spellEnd"/>
+            <w:r>
+              <w:rPr>
+                <w:color w:val="0000FF"/>
+                <w:sz w:val="20"/>
+                <w:szCs w:val="20"/>
+                <w:highlight w:val="yellow"/>
+              </w:rPr>
+              <w:t xml:space="preserve"> and tested it.</w:t>
             </w:r>
           </w:p>
           <w:p>
@@ -2449,8 +2714,39 @@
                 <w:szCs w:val="20"/>
                 <w:highlight w:val="yellow"/>
               </w:rPr>
-              <w:t>Tested dataStruct.c and traversal.c</w:t>
-            </w:r>
+              <w:t xml:space="preserve">Tested </w:t>
+            </w:r>
+            <w:proofErr w:type="spellStart"/>
+            <w:r>
+              <w:rPr>
+                <w:color w:val="0000FF"/>
+                <w:sz w:val="20"/>
+                <w:szCs w:val="20"/>
+                <w:highlight w:val="yellow"/>
+              </w:rPr>
+              <w:t>dataStruct.c</w:t>
+            </w:r>
+            <w:proofErr w:type="spellEnd"/>
+            <w:r>
+              <w:rPr>
+                <w:color w:val="0000FF"/>
+                <w:sz w:val="20"/>
+                <w:szCs w:val="20"/>
+                <w:highlight w:val="yellow"/>
+              </w:rPr>
+              <w:t xml:space="preserve"> and </w:t>
+            </w:r>
+            <w:proofErr w:type="spellStart"/>
+            <w:r>
+              <w:rPr>
+                <w:color w:val="0000FF"/>
+                <w:sz w:val="20"/>
+                <w:szCs w:val="20"/>
+                <w:highlight w:val="yellow"/>
+              </w:rPr>
+              <w:t>traversal.c</w:t>
+            </w:r>
+            <w:proofErr w:type="spellEnd"/>
           </w:p>
           <w:p>
             <w:pPr>
@@ -2491,7 +2787,27 @@
                 <w:szCs w:val="20"/>
                 <w:highlight w:val="yellow"/>
               </w:rPr>
-              <w:t xml:space="preserve"> Completed the documentation within the  source code file</w:t>
+              <w:t xml:space="preserve"> Completed the documentation within </w:t>
+            </w:r>
+            <w:proofErr w:type="gramStart"/>
+            <w:r>
+              <w:rPr>
+                <w:color w:val="0000FF"/>
+                <w:sz w:val="20"/>
+                <w:szCs w:val="20"/>
+                <w:highlight w:val="yellow"/>
+              </w:rPr>
+              <w:t>the  source</w:t>
+            </w:r>
+            <w:proofErr w:type="gramEnd"/>
+            <w:r>
+              <w:rPr>
+                <w:color w:val="0000FF"/>
+                <w:sz w:val="20"/>
+                <w:szCs w:val="20"/>
+                <w:highlight w:val="yellow"/>
+              </w:rPr>
+              <w:t xml:space="preserve"> code file</w:t>
             </w:r>
             <w:r>
               <w:rPr>
@@ -2511,6 +2827,7 @@
               </w:rPr>
               <w:t xml:space="preserve">Ran and tested the </w:t>
             </w:r>
+            <w:proofErr w:type="spellStart"/>
             <w:r>
               <w:rPr>
                 <w:color w:val="0000FF"/>
@@ -2538,6 +2855,7 @@
               </w:rPr>
               <w:t>c</w:t>
             </w:r>
+            <w:proofErr w:type="spellEnd"/>
             <w:r>
               <w:rPr>
                 <w:color w:val="0000FF"/>
@@ -2873,8 +3191,19 @@
                 <w:szCs w:val="20"/>
                 <w:highlight w:val="yellow"/>
               </w:rPr>
-              <w:t xml:space="preserve"> in graph.c</w:t>
-            </w:r>
+              <w:t xml:space="preserve"> in </w:t>
+            </w:r>
+            <w:proofErr w:type="spellStart"/>
+            <w:r>
+              <w:rPr>
+                <w:color w:val="0000FF"/>
+                <w:sz w:val="20"/>
+                <w:szCs w:val="20"/>
+                <w:highlight w:val="yellow"/>
+              </w:rPr>
+              <w:t>graph.c</w:t>
+            </w:r>
+            <w:proofErr w:type="spellEnd"/>
           </w:p>
           <w:p>
             <w:pPr>
@@ -3737,6 +4066,7 @@
         </w:rPr>
         <w:t xml:space="preserve">               C:\MCO2&gt; </w:t>
       </w:r>
+      <w:proofErr w:type="spellStart"/>
       <w:r>
         <w:rPr>
           <w:b/>
@@ -3745,7 +4075,40 @@
           <w:szCs w:val="20"/>
           <w:highlight w:val="yellow"/>
         </w:rPr>
-        <w:t>gcc -Wall main.c -o main.exe</w:t>
+        <w:t>gcc</w:t>
+      </w:r>
+      <w:proofErr w:type="spellEnd"/>
+      <w:r>
+        <w:rPr>
+          <w:b/>
+          <w:bCs/>
+          <w:sz w:val="20"/>
+          <w:szCs w:val="20"/>
+          <w:highlight w:val="yellow"/>
+        </w:rPr>
+        <w:t xml:space="preserve"> -Wall </w:t>
+      </w:r>
+      <w:proofErr w:type="spellStart"/>
+      <w:r>
+        <w:rPr>
+          <w:b/>
+          <w:bCs/>
+          <w:sz w:val="20"/>
+          <w:szCs w:val="20"/>
+          <w:highlight w:val="yellow"/>
+        </w:rPr>
+        <w:t>main.c</w:t>
+      </w:r>
+      <w:proofErr w:type="spellEnd"/>
+      <w:r>
+        <w:rPr>
+          <w:b/>
+          <w:bCs/>
+          <w:sz w:val="20"/>
+          <w:szCs w:val="20"/>
+          <w:highlight w:val="yellow"/>
+        </w:rPr>
+        <w:t xml:space="preserve"> -o main.exe</w:t>
       </w:r>
     </w:p>
     <w:p>
@@ -4015,7 +4378,25 @@
           <w:sz w:val="20"/>
           <w:szCs w:val="20"/>
         </w:rPr>
-        <w:t>WARNING: there will be a 1 point deduction for every unique compiler warning.  Please make sure that your submission does not have a compiler warning.</w:t>
+        <w:t xml:space="preserve">WARNING: there will be a </w:t>
+      </w:r>
+      <w:proofErr w:type="gramStart"/>
+      <w:r>
+        <w:rPr>
+          <w:color w:val="FF0000"/>
+          <w:sz w:val="20"/>
+          <w:szCs w:val="20"/>
+        </w:rPr>
+        <w:t>1 point</w:t>
+      </w:r>
+      <w:proofErr w:type="gramEnd"/>
+      <w:r>
+        <w:rPr>
+          <w:color w:val="FF0000"/>
+          <w:sz w:val="20"/>
+          <w:szCs w:val="20"/>
+        </w:rPr>
+        <w:t xml:space="preserve"> deduction for every unique compiler warning.  Please make sure that your submission does not have a compiler warning.</w:t>
       </w:r>
     </w:p>
     <w:p>
@@ -4122,13 +4503,23 @@
       <w:r>
         <w:t xml:space="preserve">MCO2&gt; </w:t>
       </w:r>
+      <w:proofErr w:type="spellStart"/>
       <w:r>
         <w:rPr>
           <w:b/>
           <w:bCs/>
           <w:highlight w:val="yellow"/>
         </w:rPr>
-        <w:t>gcc -Wall 01-BONUS.c -o 01-BONUS.exe</w:t>
+        <w:t>gcc</w:t>
+      </w:r>
+      <w:proofErr w:type="spellEnd"/>
+      <w:r>
+        <w:rPr>
+          <w:b/>
+          <w:bCs/>
+          <w:highlight w:val="yellow"/>
+        </w:rPr>
+        <w:t xml:space="preserve"> -Wall 01-BONUS.c -o 01-BONUS.exe</w:t>
       </w:r>
     </w:p>
     <w:p>
@@ -4198,7 +4589,27 @@
           <w:sz w:val="20"/>
           <w:szCs w:val="20"/>
         </w:rPr>
-        <w:t>IV.  DISCLOSURE OF ERROR(S)</w:t>
+        <w:t>IV</w:t>
+      </w:r>
+      <w:proofErr w:type="gramStart"/>
+      <w:r>
+        <w:rPr>
+          <w:b/>
+          <w:bCs/>
+          <w:sz w:val="20"/>
+          <w:szCs w:val="20"/>
+        </w:rPr>
+        <w:t>.  DISCLOSURE</w:t>
+      </w:r>
+      <w:proofErr w:type="gramEnd"/>
+      <w:r>
+        <w:rPr>
+          <w:b/>
+          <w:bCs/>
+          <w:sz w:val="20"/>
+          <w:szCs w:val="20"/>
+        </w:rPr>
+        <w:t xml:space="preserve"> OF ERROR(S)</w:t>
       </w:r>
     </w:p>
     <w:p>
@@ -4248,7 +4659,25 @@
           <w:sz w:val="20"/>
           <w:szCs w:val="20"/>
         </w:rPr>
-        <w:t xml:space="preserve">  Explain briefly the reason why your group was not able to make it work.</w:t>
+        <w:t xml:space="preserve">  Explain briefly the reason why your group </w:t>
+      </w:r>
+      <w:proofErr w:type="gramStart"/>
+      <w:r>
+        <w:rPr>
+          <w:color w:val="999999"/>
+          <w:sz w:val="20"/>
+          <w:szCs w:val="20"/>
+        </w:rPr>
+        <w:t>was not able to</w:t>
+      </w:r>
+      <w:proofErr w:type="gramEnd"/>
+      <w:r>
+        <w:rPr>
+          <w:color w:val="999999"/>
+          <w:sz w:val="20"/>
+          <w:szCs w:val="20"/>
+        </w:rPr>
+        <w:t xml:space="preserve"> make it work.</w:t>
       </w:r>
     </w:p>
     <w:p>
@@ -4299,11 +4728,30 @@
         </w:rPr>
         <w:t>a.</w:t>
       </w:r>
+      <w:r>
+        <w:rPr>
+          <w:color w:val="0000FF"/>
+          <w:sz w:val="20"/>
+          <w:szCs w:val="20"/>
+          <w:highlight w:val="yellow"/>
+        </w:rPr>
+        <w:t xml:space="preserve"> N/A</w:t>
+      </w:r>
     </w:p>
     <w:p>
       <w:pPr>
         <w:spacing w:after="30"/>
         <w:rPr>
+          <w:sz w:val="20"/>
+          <w:szCs w:val="20"/>
+          <w:highlight w:val="yellow"/>
+        </w:rPr>
+      </w:pPr>
+    </w:p>
+    <w:p>
+      <w:pPr>
+        <w:spacing w:after="30"/>
+        <w:rPr>
           <w:color w:val="0000FF"/>
           <w:sz w:val="20"/>
           <w:szCs w:val="20"/>
@@ -4317,29 +4765,48 @@
           <w:szCs w:val="20"/>
           <w:highlight w:val="yellow"/>
         </w:rPr>
-        <w:t>b.</w:t>
+        <w:t xml:space="preserve">We </w:t>
+      </w:r>
+      <w:proofErr w:type="gramStart"/>
+      <w:r>
+        <w:rPr>
+          <w:color w:val="0000FF"/>
+          <w:sz w:val="20"/>
+          <w:szCs w:val="20"/>
+          <w:highlight w:val="yellow"/>
+        </w:rPr>
+        <w:t>were not able to</w:t>
+      </w:r>
+      <w:proofErr w:type="gramEnd"/>
+      <w:r>
+        <w:rPr>
+          <w:color w:val="0000FF"/>
+          <w:sz w:val="20"/>
+          <w:szCs w:val="20"/>
+          <w:highlight w:val="yellow"/>
+        </w:rPr>
+        <w:t xml:space="preserve"> make them work because:</w:t>
       </w:r>
     </w:p>
     <w:p>
       <w:pPr>
         <w:spacing w:after="30"/>
         <w:rPr>
+          <w:color w:val="0000FF"/>
           <w:sz w:val="20"/>
           <w:szCs w:val="20"/>
           <w:highlight w:val="yellow"/>
         </w:rPr>
       </w:pPr>
-    </w:p>
-    <w:p>
-      <w:pPr>
-        <w:spacing w:after="30"/>
+      <w:r>
         <w:rPr>
           <w:color w:val="0000FF"/>
           <w:sz w:val="20"/>
           <w:szCs w:val="20"/>
           <w:highlight w:val="yellow"/>
         </w:rPr>
-      </w:pPr>
+        <w:t>a.</w:t>
+      </w:r>
       <w:r>
         <w:rPr>
           <w:color w:val="0000FF"/>
@@ -4347,48 +4814,7 @@
           <w:szCs w:val="20"/>
           <w:highlight w:val="yellow"/>
         </w:rPr>
-        <w:t>We were not able to make them work because:</w:t>
-      </w:r>
-    </w:p>
-    <w:p>
-      <w:pPr>
-        <w:spacing w:after="30"/>
-        <w:rPr>
-          <w:color w:val="0000FF"/>
-          <w:sz w:val="20"/>
-          <w:szCs w:val="20"/>
-          <w:highlight w:val="yellow"/>
-        </w:rPr>
-      </w:pPr>
-      <w:r>
-        <w:rPr>
-          <w:color w:val="0000FF"/>
-          <w:sz w:val="20"/>
-          <w:szCs w:val="20"/>
-          <w:highlight w:val="yellow"/>
-        </w:rPr>
-        <w:t>a.</w:t>
-      </w:r>
-    </w:p>
-    <w:p>
-      <w:pPr>
-        <w:spacing w:after="30"/>
-        <w:rPr>
-          <w:b/>
-          <w:bCs/>
-          <w:color w:val="0000FF"/>
-          <w:sz w:val="20"/>
-          <w:szCs w:val="20"/>
-        </w:rPr>
-      </w:pPr>
-      <w:r>
-        <w:rPr>
-          <w:color w:val="0000FF"/>
-          <w:sz w:val="20"/>
-          <w:szCs w:val="20"/>
-          <w:highlight w:val="yellow"/>
-        </w:rPr>
-        <w:t>b.</w:t>
+        <w:t xml:space="preserve"> N/A</w:t>
       </w:r>
       <w:r>
         <w:rPr>
@@ -4471,7 +4897,15 @@
               <w:spacing w:after="30"/>
             </w:pPr>
             <w:r>
-              <w:t>1.  How did you implement your Graph data structure? Did you implement it using an Adjacency Matrix or Adjacency List or both? What is the reason behind your choice of graph data structure implementation? Explain briefly (at most 5 sentences).</w:t>
+              <w:t>1</w:t>
+            </w:r>
+            <w:proofErr w:type="gramStart"/>
+            <w:r>
+              <w:t>.  How</w:t>
+            </w:r>
+            <w:proofErr w:type="gramEnd"/>
+            <w:r>
+              <w:t xml:space="preserve"> did you implement your Graph data structure? Did you implement it using an Adjacency Matrix or Adjacency List or both? What is the reason behind your choice of graph data structure implementation? Explain briefly (at most 5 sentences).</w:t>
             </w:r>
           </w:p>
           <w:p>
@@ -4599,6 +5033,7 @@
               <w:spacing w:after="30"/>
             </w:pPr>
             <w:r>
+              <w:lastRenderedPageBreak/>
               <w:t xml:space="preserve"> </w:t>
             </w:r>
           </w:p>
@@ -4646,7 +5081,27 @@
           <w:sz w:val="20"/>
           <w:szCs w:val="20"/>
         </w:rPr>
-        <w:t>VI.  SELF-EVALUATION</w:t>
+        <w:t>VI</w:t>
+      </w:r>
+      <w:proofErr w:type="gramStart"/>
+      <w:r>
+        <w:rPr>
+          <w:b/>
+          <w:bCs/>
+          <w:sz w:val="20"/>
+          <w:szCs w:val="20"/>
+        </w:rPr>
+        <w:t>.  SELF</w:t>
+      </w:r>
+      <w:proofErr w:type="gramEnd"/>
+      <w:r>
+        <w:rPr>
+          <w:b/>
+          <w:bCs/>
+          <w:sz w:val="20"/>
+          <w:szCs w:val="20"/>
+        </w:rPr>
+        <w:t>-EVALUATION</w:t>
       </w:r>
     </w:p>
     <w:p>
@@ -4875,7 +5330,23 @@
                 <w:sz w:val="20"/>
                 <w:szCs w:val="20"/>
               </w:rPr>
-              <w:t>     (max. 10 points)</w:t>
+              <w:t xml:space="preserve">  </w:t>
+            </w:r>
+            <w:proofErr w:type="gramStart"/>
+            <w:r>
+              <w:rPr>
+                <w:sz w:val="20"/>
+                <w:szCs w:val="20"/>
+              </w:rPr>
+              <w:t xml:space="preserve">   (</w:t>
+            </w:r>
+            <w:proofErr w:type="gramEnd"/>
+            <w:r>
+              <w:rPr>
+                <w:sz w:val="20"/>
+                <w:szCs w:val="20"/>
+              </w:rPr>
+              <w:t>max. 10 points)</w:t>
             </w:r>
           </w:p>
         </w:tc>
@@ -4906,7 +5377,15 @@
               <w:t xml:space="preserve">2. </w:t>
             </w:r>
             <w:r>
-              <w:t>Output Text File #2 (Vertices With Degrees)</w:t>
+              <w:t xml:space="preserve">Output Text File #2 (Vertices </w:t>
+            </w:r>
+            <w:proofErr w:type="gramStart"/>
+            <w:r>
+              <w:t>With</w:t>
+            </w:r>
+            <w:proofErr w:type="gramEnd"/>
+            <w:r>
+              <w:t xml:space="preserve"> Degrees)</w:t>
             </w:r>
           </w:p>
         </w:tc>
@@ -4958,7 +5437,23 @@
                 <w:sz w:val="20"/>
                 <w:szCs w:val="20"/>
               </w:rPr>
-              <w:t>     (max. 10 points)</w:t>
+              <w:t xml:space="preserve">  </w:t>
+            </w:r>
+            <w:proofErr w:type="gramStart"/>
+            <w:r>
+              <w:rPr>
+                <w:sz w:val="20"/>
+                <w:szCs w:val="20"/>
+              </w:rPr>
+              <w:t xml:space="preserve">   (</w:t>
+            </w:r>
+            <w:proofErr w:type="gramEnd"/>
+            <w:r>
+              <w:rPr>
+                <w:sz w:val="20"/>
+                <w:szCs w:val="20"/>
+              </w:rPr>
+              <w:t>max. 10 points)</w:t>
             </w:r>
           </w:p>
         </w:tc>
@@ -5040,7 +5535,23 @@
                 <w:sz w:val="20"/>
                 <w:szCs w:val="20"/>
               </w:rPr>
-              <w:t>     (max. 12.5 points)</w:t>
+              <w:t xml:space="preserve">  </w:t>
+            </w:r>
+            <w:proofErr w:type="gramStart"/>
+            <w:r>
+              <w:rPr>
+                <w:sz w:val="20"/>
+                <w:szCs w:val="20"/>
+              </w:rPr>
+              <w:t xml:space="preserve">   (</w:t>
+            </w:r>
+            <w:proofErr w:type="gramEnd"/>
+            <w:r>
+              <w:rPr>
+                <w:sz w:val="20"/>
+                <w:szCs w:val="20"/>
+              </w:rPr>
+              <w:t>max. 12.5 points)</w:t>
             </w:r>
           </w:p>
         </w:tc>
@@ -5120,7 +5631,23 @@
                 <w:sz w:val="20"/>
                 <w:szCs w:val="20"/>
               </w:rPr>
-              <w:t>     (max. 12.5 points)</w:t>
+              <w:t xml:space="preserve">  </w:t>
+            </w:r>
+            <w:proofErr w:type="gramStart"/>
+            <w:r>
+              <w:rPr>
+                <w:sz w:val="20"/>
+                <w:szCs w:val="20"/>
+              </w:rPr>
+              <w:t xml:space="preserve">   (</w:t>
+            </w:r>
+            <w:proofErr w:type="gramEnd"/>
+            <w:r>
+              <w:rPr>
+                <w:sz w:val="20"/>
+                <w:szCs w:val="20"/>
+              </w:rPr>
+              <w:t>max. 12.5 points)</w:t>
             </w:r>
           </w:p>
         </w:tc>
@@ -5202,7 +5729,23 @@
                 <w:sz w:val="20"/>
                 <w:szCs w:val="20"/>
               </w:rPr>
-              <w:t>     (max. 20 points)</w:t>
+              <w:t xml:space="preserve">  </w:t>
+            </w:r>
+            <w:proofErr w:type="gramStart"/>
+            <w:r>
+              <w:rPr>
+                <w:sz w:val="20"/>
+                <w:szCs w:val="20"/>
+              </w:rPr>
+              <w:t xml:space="preserve">   (</w:t>
+            </w:r>
+            <w:proofErr w:type="gramEnd"/>
+            <w:r>
+              <w:rPr>
+                <w:sz w:val="20"/>
+                <w:szCs w:val="20"/>
+              </w:rPr>
+              <w:t>max. 20 points)</w:t>
             </w:r>
           </w:p>
         </w:tc>
@@ -5284,7 +5827,23 @@
                 <w:sz w:val="20"/>
                 <w:szCs w:val="20"/>
               </w:rPr>
-              <w:t>     (max. 20 points)</w:t>
+              <w:t xml:space="preserve">  </w:t>
+            </w:r>
+            <w:proofErr w:type="gramStart"/>
+            <w:r>
+              <w:rPr>
+                <w:sz w:val="20"/>
+                <w:szCs w:val="20"/>
+              </w:rPr>
+              <w:t xml:space="preserve">   (</w:t>
+            </w:r>
+            <w:proofErr w:type="gramEnd"/>
+            <w:r>
+              <w:rPr>
+                <w:sz w:val="20"/>
+                <w:szCs w:val="20"/>
+              </w:rPr>
+              <w:t>max. 20 points)</w:t>
             </w:r>
           </w:p>
         </w:tc>
@@ -5366,7 +5925,23 @@
                 <w:sz w:val="20"/>
                 <w:szCs w:val="20"/>
               </w:rPr>
-              <w:t>     (max. 10 points)</w:t>
+              <w:t xml:space="preserve">  </w:t>
+            </w:r>
+            <w:proofErr w:type="gramStart"/>
+            <w:r>
+              <w:rPr>
+                <w:sz w:val="20"/>
+                <w:szCs w:val="20"/>
+              </w:rPr>
+              <w:t xml:space="preserve">   (</w:t>
+            </w:r>
+            <w:proofErr w:type="gramEnd"/>
+            <w:r>
+              <w:rPr>
+                <w:sz w:val="20"/>
+                <w:szCs w:val="20"/>
+              </w:rPr>
+              <w:t>max. 10 points)</w:t>
             </w:r>
           </w:p>
         </w:tc>
@@ -5448,7 +6023,23 @@
                 <w:sz w:val="20"/>
                 <w:szCs w:val="20"/>
               </w:rPr>
-              <w:t>     (max. 5 points)</w:t>
+              <w:t xml:space="preserve">  </w:t>
+            </w:r>
+            <w:proofErr w:type="gramStart"/>
+            <w:r>
+              <w:rPr>
+                <w:sz w:val="20"/>
+                <w:szCs w:val="20"/>
+              </w:rPr>
+              <w:t xml:space="preserve">   (</w:t>
+            </w:r>
+            <w:proofErr w:type="gramEnd"/>
+            <w:r>
+              <w:rPr>
+                <w:sz w:val="20"/>
+                <w:szCs w:val="20"/>
+              </w:rPr>
+              <w:t>max. 5 points)</w:t>
             </w:r>
           </w:p>
         </w:tc>
@@ -5536,7 +6127,23 @@
                 <w:sz w:val="20"/>
                 <w:szCs w:val="20"/>
               </w:rPr>
-              <w:t>     (max. 10 points)</w:t>
+              <w:t xml:space="preserve">  </w:t>
+            </w:r>
+            <w:proofErr w:type="gramStart"/>
+            <w:r>
+              <w:rPr>
+                <w:sz w:val="20"/>
+                <w:szCs w:val="20"/>
+              </w:rPr>
+              <w:t xml:space="preserve">   (</w:t>
+            </w:r>
+            <w:proofErr w:type="gramEnd"/>
+            <w:r>
+              <w:rPr>
+                <w:sz w:val="20"/>
+                <w:szCs w:val="20"/>
+              </w:rPr>
+              <w:t>max. 10 points)</w:t>
             </w:r>
           </w:p>
         </w:tc>
@@ -5731,6 +6338,7 @@
         </w:rPr>
         <w:t xml:space="preserve">                                                                                                       </w:t>
       </w:r>
+      <w:proofErr w:type="spellStart"/>
       <w:r>
         <w:rPr>
           <w:rFonts w:ascii="MS Gothic" w:eastAsia="MS Gothic" w:hAnsi="MS Gothic" w:cs="MS Gothic"/>
@@ -5744,6 +6352,7 @@
         </w:rPr>
         <w:t>サルバド</w:t>
       </w:r>
+      <w:proofErr w:type="spellEnd"/>
       <w:r>
         <w:rPr>
           <w:rFonts w:ascii="Helvetica Neue" w:eastAsia="Helvetica Neue" w:hAnsi="Helvetica Neue" w:cs="Helvetica Neue"/>
@@ -5757,6 +6366,7 @@
         </w:rPr>
         <w:t>-</w:t>
       </w:r>
+      <w:proofErr w:type="spellStart"/>
       <w:r>
         <w:rPr>
           <w:rFonts w:ascii="MS Gothic" w:eastAsia="MS Gothic" w:hAnsi="MS Gothic" w:cs="MS Gothic"/>
@@ -5770,6 +6380,7 @@
         </w:rPr>
         <w:t>ル・フロランテ</w:t>
       </w:r>
+      <w:proofErr w:type="spellEnd"/>
     </w:p>
     <w:p>
       <w:pPr>

</xml_diff>

<commit_message>
Completed main.c, edited docx, added input text files
</commit_message>
<xml_diff>
--- a/MCO2-Documentation-18.docx
+++ b/MCO2-Documentation-18.docx
@@ -120,27 +120,7 @@
                 <w:sz w:val="20"/>
                 <w:szCs w:val="20"/>
               </w:rPr>
-              <w:t xml:space="preserve">We declare that the project we are submitting is the product of our own work augmented with responsible and ethical use of generative AI as encoded in Table </w:t>
-            </w:r>
-            <w:proofErr w:type="gramStart"/>
-            <w:r>
-              <w:rPr>
-                <w:i/>
-                <w:iCs/>
-                <w:sz w:val="20"/>
-                <w:szCs w:val="20"/>
-              </w:rPr>
-              <w:t>1  and</w:t>
-            </w:r>
-            <w:proofErr w:type="gramEnd"/>
-            <w:r>
-              <w:rPr>
-                <w:i/>
-                <w:iCs/>
-                <w:sz w:val="20"/>
-                <w:szCs w:val="20"/>
-              </w:rPr>
-              <w:t xml:space="preserve"> Table 2 below.</w:t>
+              <w:t>We declare that the project we are submitting is the product of our own work augmented with responsible and ethical use of generative AI as encoded in Table 1  and Table 2 below.</w:t>
             </w:r>
           </w:p>
           <w:p>
@@ -342,29 +322,7 @@
                 <w:sz w:val="20"/>
                 <w:szCs w:val="20"/>
               </w:rPr>
-              <w:t xml:space="preserve">// Instruction #1: Encode your </w:t>
-            </w:r>
-            <w:proofErr w:type="gramStart"/>
-            <w:r>
-              <w:rPr>
-                <w:b/>
-                <w:bCs/>
-                <w:color w:val="999999"/>
-                <w:sz w:val="20"/>
-                <w:szCs w:val="20"/>
-              </w:rPr>
-              <w:t>names, and</w:t>
-            </w:r>
-            <w:proofErr w:type="gramEnd"/>
-            <w:r>
-              <w:rPr>
-                <w:b/>
-                <w:bCs/>
-                <w:color w:val="999999"/>
-                <w:sz w:val="20"/>
-                <w:szCs w:val="20"/>
-              </w:rPr>
-              <w:t xml:space="preserve"> affix your e-signature to attest to the declaration above.</w:t>
+              <w:t>// Instruction #1: Encode your names, and affix your e-signature to attest to the declaration above.</w:t>
             </w:r>
           </w:p>
           <w:p>
@@ -630,29 +588,7 @@
           <w:sz w:val="20"/>
           <w:szCs w:val="20"/>
         </w:rPr>
-        <w:t xml:space="preserve">// Instruction #2: Fill-up </w:t>
-      </w:r>
-      <w:proofErr w:type="gramStart"/>
-      <w:r>
-        <w:rPr>
-          <w:b/>
-          <w:bCs/>
-          <w:color w:val="999999"/>
-          <w:sz w:val="20"/>
-          <w:szCs w:val="20"/>
-        </w:rPr>
-        <w:t>the column</w:t>
-      </w:r>
-      <w:proofErr w:type="gramEnd"/>
-      <w:r>
-        <w:rPr>
-          <w:b/>
-          <w:bCs/>
-          <w:color w:val="999999"/>
-          <w:sz w:val="20"/>
-          <w:szCs w:val="20"/>
-        </w:rPr>
-        <w:t xml:space="preserve"> 2 of Table 1 below.</w:t>
+        <w:t>// Instruction #2: Fill-up the column 2 of Table 1 below.</w:t>
       </w:r>
     </w:p>
     <w:p>
@@ -1242,7 +1178,7 @@
                 <w:szCs w:val="20"/>
                 <w:highlight w:val="yellow"/>
               </w:rPr>
-              <w:t xml:space="preserve">NONE </w:t>
+              <w:t xml:space="preserve">SCAFFOLDING – Gemini was used to </w:t>
             </w:r>
             <w:r>
               <w:rPr>
@@ -1253,7 +1189,7 @@
                 <w:szCs w:val="20"/>
                 <w:highlight w:val="yellow"/>
               </w:rPr>
-              <w:t>– The main driver was made all by human.</w:t>
+              <w:t>provide the blueprint for the flow of code, only brainstorming was the need for Gemini, all code written was made 100% by human.</w:t>
             </w:r>
             <w:r>
               <w:rPr>
@@ -1358,31 +1294,7 @@
                 <w:szCs w:val="20"/>
                 <w:highlight w:val="yellow"/>
               </w:rPr>
-              <w:t xml:space="preserve">All test cases were made by </w:t>
-            </w:r>
-            <w:proofErr w:type="gramStart"/>
-            <w:r>
-              <w:rPr>
-                <w:i/>
-                <w:iCs/>
-                <w:color w:val="0000FF"/>
-                <w:sz w:val="20"/>
-                <w:szCs w:val="20"/>
-                <w:highlight w:val="yellow"/>
-              </w:rPr>
-              <w:t>human,</w:t>
-            </w:r>
-            <w:proofErr w:type="gramEnd"/>
-            <w:r>
-              <w:rPr>
-                <w:i/>
-                <w:iCs/>
-                <w:color w:val="0000FF"/>
-                <w:sz w:val="20"/>
-                <w:szCs w:val="20"/>
-                <w:highlight w:val="yellow"/>
-              </w:rPr>
-              <w:t xml:space="preserve"> debugging was also done manually by human only</w:t>
+              <w:t>All test cases were made by human, debugging was also done manually by human only</w:t>
             </w:r>
             <w:r>
               <w:rPr>
@@ -1422,6 +1334,7 @@
               </w:rPr>
             </w:pPr>
             <w:r>
+              <w:lastRenderedPageBreak/>
               <w:t>Task 6. Document your project.</w:t>
             </w:r>
           </w:p>
@@ -1472,7 +1385,6 @@
                 <w:szCs w:val="20"/>
                 <w:highlight w:val="yellow"/>
               </w:rPr>
-              <w:lastRenderedPageBreak/>
               <w:t>REFINEMENT – Our drafted documentation was all humanly generated, then asked for feedback from AI to help clarify the descriptions (mainly for the parameters portion of the documentation in the source files)</w:t>
             </w:r>
           </w:p>
@@ -1519,10 +1431,13 @@
           <w:sz w:val="20"/>
           <w:szCs w:val="20"/>
         </w:rPr>
-        <w:t xml:space="preserve">// Instruction #3: Fill up Table 2. List explicitly ALL AI tools that you </w:t>
-      </w:r>
-      <w:proofErr w:type="gramStart"/>
-      <w:r>
+        <w:t>// Instruction #3: Fill up Table 2. List explicitly ALL AI tools that you employed, and justify their purpose/role in your project.</w:t>
+      </w:r>
+    </w:p>
+    <w:p>
+      <w:pPr>
+        <w:spacing w:after="30"/>
+        <w:jc w:val="both"/>
         <w:rPr>
           <w:b/>
           <w:bCs/>
@@ -1530,72 +1445,27 @@
           <w:sz w:val="20"/>
           <w:szCs w:val="20"/>
         </w:rPr>
-        <w:t>employed, and</w:t>
-      </w:r>
-      <w:proofErr w:type="gramEnd"/>
-      <w:r>
+      </w:pPr>
+    </w:p>
+    <w:p>
+      <w:pPr>
+        <w:spacing w:after="30"/>
+        <w:jc w:val="center"/>
         <w:rPr>
           <w:b/>
           <w:bCs/>
-          <w:color w:val="999999"/>
-          <w:sz w:val="20"/>
-          <w:szCs w:val="20"/>
-        </w:rPr>
-        <w:t xml:space="preserve"> justify their purpose/role in your project.</w:t>
-      </w:r>
-    </w:p>
-    <w:p>
-      <w:pPr>
-        <w:spacing w:after="30"/>
-        <w:jc w:val="both"/>
+          <w:sz w:val="20"/>
+          <w:szCs w:val="20"/>
+        </w:rPr>
+      </w:pPr>
+      <w:r>
         <w:rPr>
           <w:b/>
           <w:bCs/>
-          <w:color w:val="999999"/>
-          <w:sz w:val="20"/>
-          <w:szCs w:val="20"/>
-        </w:rPr>
-      </w:pPr>
-    </w:p>
-    <w:p>
-      <w:pPr>
-        <w:spacing w:after="30"/>
-        <w:jc w:val="center"/>
-        <w:rPr>
-          <w:b/>
-          <w:bCs/>
-          <w:sz w:val="20"/>
-          <w:szCs w:val="20"/>
-        </w:rPr>
-      </w:pPr>
-      <w:r>
-        <w:rPr>
-          <w:b/>
-          <w:bCs/>
-          <w:sz w:val="20"/>
-          <w:szCs w:val="20"/>
-        </w:rPr>
-        <w:t xml:space="preserve">Table 2. List of </w:t>
-      </w:r>
-      <w:proofErr w:type="gramStart"/>
-      <w:r>
-        <w:rPr>
-          <w:b/>
-          <w:bCs/>
-          <w:sz w:val="20"/>
-          <w:szCs w:val="20"/>
-        </w:rPr>
-        <w:t>AI</w:t>
-      </w:r>
-      <w:proofErr w:type="gramEnd"/>
-      <w:r>
-        <w:rPr>
-          <w:b/>
-          <w:bCs/>
-          <w:sz w:val="20"/>
-          <w:szCs w:val="20"/>
-        </w:rPr>
-        <w:t xml:space="preserve"> Tools Used</w:t>
+          <w:sz w:val="20"/>
+          <w:szCs w:val="20"/>
+        </w:rPr>
+        <w:t>Table 2. List of AI Tools Used</w:t>
       </w:r>
     </w:p>
     <w:tbl>
@@ -1713,7 +1583,27 @@
                 <w:szCs w:val="20"/>
                 <w:highlight w:val="yellow"/>
               </w:rPr>
-              <w:t>Google Gemini (https://gemini.google.com/)</w:t>
+              <w:t>Google Gemini (</w:t>
+            </w:r>
+            <w:hyperlink r:id="rId11" w:history="1">
+              <w:r>
+                <w:rPr>
+                  <w:rStyle w:val="Hyperlink"/>
+                  <w:sz w:val="20"/>
+                  <w:szCs w:val="20"/>
+                  <w:highlight w:val="yellow"/>
+                </w:rPr>
+                <w:t>https://gemini</w:t>
+              </w:r>
+            </w:hyperlink>
+            <w:r>
+              <w:rPr>
+                <w:color w:val="0000FF"/>
+                <w:sz w:val="20"/>
+                <w:szCs w:val="20"/>
+                <w:highlight w:val="yellow"/>
+              </w:rPr>
+              <w:t>.google.com/)</w:t>
             </w:r>
           </w:p>
         </w:tc>
@@ -2071,25 +1961,23 @@
               </w:rPr>
               <w:t xml:space="preserve">Encode details of your contributions for each task. Indicate your role, for example, were you the project manager, were you the (lead) programmer for a certain module, were you the (black box) tester for a certain module, which part of the documentation were you responsible for? </w:t>
             </w:r>
-            <w:proofErr w:type="spellStart"/>
-            <w:r>
-              <w:rPr>
-                <w:color w:val="0000FF"/>
-                <w:sz w:val="20"/>
-                <w:szCs w:val="20"/>
-                <w:highlight w:val="yellow"/>
-              </w:rPr>
-              <w:t>etc</w:t>
-            </w:r>
-            <w:proofErr w:type="spellEnd"/>
-            <w:r>
-              <w:rPr>
-                <w:color w:val="0000FF"/>
-                <w:sz w:val="20"/>
-                <w:szCs w:val="20"/>
-                <w:highlight w:val="yellow"/>
-              </w:rPr>
-              <w:t>… Encode NONE if you did not contribute to a particular task.</w:t>
+            <w:r>
+              <w:rPr>
+                <w:color w:val="0000FF"/>
+                <w:sz w:val="20"/>
+                <w:szCs w:val="20"/>
+                <w:highlight w:val="yellow"/>
+              </w:rPr>
+              <w:t>E</w:t>
+            </w:r>
+            <w:r>
+              <w:rPr>
+                <w:color w:val="0000FF"/>
+                <w:sz w:val="20"/>
+                <w:szCs w:val="20"/>
+                <w:highlight w:val="yellow"/>
+              </w:rPr>
+              <w:t>tc… Encode NONE if you did not contribute to a particular task.</w:t>
             </w:r>
           </w:p>
           <w:p>
@@ -2151,45 +2039,14 @@
               </w:rPr>
               <w:t xml:space="preserve">, and provided the data structures, </w:t>
             </w:r>
-            <w:proofErr w:type="spellStart"/>
-            <w:r>
-              <w:rPr>
-                <w:color w:val="0000FF"/>
-                <w:sz w:val="20"/>
-                <w:szCs w:val="20"/>
-                <w:highlight w:val="yellow"/>
-              </w:rPr>
-              <w:t>dataStruct.c</w:t>
-            </w:r>
-            <w:proofErr w:type="spellEnd"/>
-            <w:r>
-              <w:rPr>
-                <w:color w:val="0000FF"/>
-                <w:sz w:val="20"/>
-                <w:szCs w:val="20"/>
-                <w:highlight w:val="yellow"/>
-              </w:rPr>
-              <w:t xml:space="preserve"> and </w:t>
-            </w:r>
-            <w:proofErr w:type="spellStart"/>
-            <w:r>
-              <w:rPr>
-                <w:color w:val="0000FF"/>
-                <w:sz w:val="20"/>
-                <w:szCs w:val="20"/>
-                <w:highlight w:val="yellow"/>
-              </w:rPr>
-              <w:t>traversal.c</w:t>
-            </w:r>
-            <w:proofErr w:type="spellEnd"/>
-            <w:r>
-              <w:rPr>
-                <w:color w:val="0000FF"/>
-                <w:sz w:val="20"/>
-                <w:szCs w:val="20"/>
-                <w:highlight w:val="yellow"/>
-              </w:rPr>
-              <w:t xml:space="preserve"> </w:t>
+            <w:r>
+              <w:rPr>
+                <w:color w:val="0000FF"/>
+                <w:sz w:val="20"/>
+                <w:szCs w:val="20"/>
+                <w:highlight w:val="yellow"/>
+              </w:rPr>
+              <w:t xml:space="preserve">dataStruct.c and traversal.c </w:t>
             </w:r>
             <w:r>
               <w:rPr>
@@ -2284,88 +2141,24 @@
               </w:rPr>
               <w:t xml:space="preserve"> Created the BFS and DFS traversal algorithms, completed </w:t>
             </w:r>
-            <w:proofErr w:type="spellStart"/>
-            <w:r>
-              <w:rPr>
-                <w:color w:val="0000FF"/>
-                <w:sz w:val="20"/>
-                <w:szCs w:val="20"/>
-                <w:highlight w:val="yellow"/>
-              </w:rPr>
-              <w:t>dataStruct.c</w:t>
-            </w:r>
-            <w:proofErr w:type="spellEnd"/>
-            <w:r>
-              <w:rPr>
-                <w:color w:val="0000FF"/>
-                <w:sz w:val="20"/>
-                <w:szCs w:val="20"/>
-                <w:highlight w:val="yellow"/>
-              </w:rPr>
-              <w:t xml:space="preserve"> and </w:t>
-            </w:r>
-            <w:proofErr w:type="spellStart"/>
-            <w:r>
-              <w:rPr>
-                <w:color w:val="0000FF"/>
-                <w:sz w:val="20"/>
-                <w:szCs w:val="20"/>
-                <w:highlight w:val="yellow"/>
-              </w:rPr>
-              <w:t>traversal.c</w:t>
-            </w:r>
-            <w:proofErr w:type="spellEnd"/>
-            <w:r>
-              <w:rPr>
-                <w:color w:val="0000FF"/>
-                <w:sz w:val="20"/>
-                <w:szCs w:val="20"/>
-                <w:highlight w:val="yellow"/>
-              </w:rPr>
-              <w:t xml:space="preserve">. Completed documentation for </w:t>
-            </w:r>
-            <w:proofErr w:type="spellStart"/>
-            <w:r>
-              <w:rPr>
-                <w:color w:val="0000FF"/>
-                <w:sz w:val="20"/>
-                <w:szCs w:val="20"/>
-                <w:highlight w:val="yellow"/>
-              </w:rPr>
-              <w:t>dataStruct.c</w:t>
-            </w:r>
-            <w:proofErr w:type="spellEnd"/>
-            <w:r>
-              <w:rPr>
-                <w:color w:val="0000FF"/>
-                <w:sz w:val="20"/>
-                <w:szCs w:val="20"/>
-                <w:highlight w:val="yellow"/>
-              </w:rPr>
-              <w:t xml:space="preserve"> and </w:t>
-            </w:r>
-            <w:proofErr w:type="spellStart"/>
-            <w:proofErr w:type="gramStart"/>
-            <w:r>
-              <w:rPr>
-                <w:color w:val="0000FF"/>
-                <w:sz w:val="20"/>
-                <w:szCs w:val="20"/>
-                <w:highlight w:val="yellow"/>
-              </w:rPr>
-              <w:t>traversal</w:t>
-            </w:r>
-            <w:proofErr w:type="gramEnd"/>
-            <w:r>
-              <w:rPr>
-                <w:color w:val="0000FF"/>
-                <w:sz w:val="20"/>
-                <w:szCs w:val="20"/>
-                <w:highlight w:val="yellow"/>
-              </w:rPr>
-              <w:t>.c</w:t>
-            </w:r>
-            <w:proofErr w:type="spellEnd"/>
+            <w:r>
+              <w:rPr>
+                <w:color w:val="0000FF"/>
+                <w:sz w:val="20"/>
+                <w:szCs w:val="20"/>
+                <w:highlight w:val="yellow"/>
+              </w:rPr>
+              <w:t>dataStruct.c and traversal.c</w:t>
+            </w:r>
+            <w:r>
+              <w:rPr>
+                <w:color w:val="0000FF"/>
+                <w:sz w:val="20"/>
+                <w:szCs w:val="20"/>
+                <w:highlight w:val="yellow"/>
+              </w:rPr>
+              <w:t>. Completed documentation for dataStruct.c and traversal.c</w:t>
+            </w:r>
           </w:p>
           <w:p>
             <w:pPr>
@@ -2643,27 +2436,7 @@
                 <w:szCs w:val="20"/>
                 <w:highlight w:val="yellow"/>
               </w:rPr>
-              <w:t xml:space="preserve">Completed documentation for </w:t>
-            </w:r>
-            <w:proofErr w:type="spellStart"/>
-            <w:r>
-              <w:rPr>
-                <w:color w:val="0000FF"/>
-                <w:sz w:val="20"/>
-                <w:szCs w:val="20"/>
-                <w:highlight w:val="yellow"/>
-              </w:rPr>
-              <w:t>graph.c</w:t>
-            </w:r>
-            <w:proofErr w:type="spellEnd"/>
-            <w:r>
-              <w:rPr>
-                <w:color w:val="0000FF"/>
-                <w:sz w:val="20"/>
-                <w:szCs w:val="20"/>
-                <w:highlight w:val="yellow"/>
-              </w:rPr>
-              <w:t xml:space="preserve"> and tested it.</w:t>
+              <w:t>Completed documentation for graph.c and tested it.</w:t>
             </w:r>
           </w:p>
           <w:p>
@@ -2714,39 +2487,8 @@
                 <w:szCs w:val="20"/>
                 <w:highlight w:val="yellow"/>
               </w:rPr>
-              <w:t xml:space="preserve">Tested </w:t>
-            </w:r>
-            <w:proofErr w:type="spellStart"/>
-            <w:r>
-              <w:rPr>
-                <w:color w:val="0000FF"/>
-                <w:sz w:val="20"/>
-                <w:szCs w:val="20"/>
-                <w:highlight w:val="yellow"/>
-              </w:rPr>
-              <w:t>dataStruct.c</w:t>
-            </w:r>
-            <w:proofErr w:type="spellEnd"/>
-            <w:r>
-              <w:rPr>
-                <w:color w:val="0000FF"/>
-                <w:sz w:val="20"/>
-                <w:szCs w:val="20"/>
-                <w:highlight w:val="yellow"/>
-              </w:rPr>
-              <w:t xml:space="preserve"> and </w:t>
-            </w:r>
-            <w:proofErr w:type="spellStart"/>
-            <w:r>
-              <w:rPr>
-                <w:color w:val="0000FF"/>
-                <w:sz w:val="20"/>
-                <w:szCs w:val="20"/>
-                <w:highlight w:val="yellow"/>
-              </w:rPr>
-              <w:t>traversal.c</w:t>
-            </w:r>
-            <w:proofErr w:type="spellEnd"/>
+              <w:t>Tested dataStruct.c and traversal.c</w:t>
+            </w:r>
           </w:p>
           <w:p>
             <w:pPr>
@@ -2787,27 +2529,7 @@
                 <w:szCs w:val="20"/>
                 <w:highlight w:val="yellow"/>
               </w:rPr>
-              <w:t xml:space="preserve"> Completed the documentation within </w:t>
-            </w:r>
-            <w:proofErr w:type="gramStart"/>
-            <w:r>
-              <w:rPr>
-                <w:color w:val="0000FF"/>
-                <w:sz w:val="20"/>
-                <w:szCs w:val="20"/>
-                <w:highlight w:val="yellow"/>
-              </w:rPr>
-              <w:t>the  source</w:t>
-            </w:r>
-            <w:proofErr w:type="gramEnd"/>
-            <w:r>
-              <w:rPr>
-                <w:color w:val="0000FF"/>
-                <w:sz w:val="20"/>
-                <w:szCs w:val="20"/>
-                <w:highlight w:val="yellow"/>
-              </w:rPr>
-              <w:t xml:space="preserve"> code file</w:t>
+              <w:t xml:space="preserve"> Completed the documentation within the  source code file</w:t>
             </w:r>
             <w:r>
               <w:rPr>
@@ -2827,7 +2549,6 @@
               </w:rPr>
               <w:t xml:space="preserve">Ran and tested the </w:t>
             </w:r>
-            <w:proofErr w:type="spellStart"/>
             <w:r>
               <w:rPr>
                 <w:color w:val="0000FF"/>
@@ -2855,7 +2576,6 @@
               </w:rPr>
               <w:t>c</w:t>
             </w:r>
-            <w:proofErr w:type="spellEnd"/>
             <w:r>
               <w:rPr>
                 <w:color w:val="0000FF"/>
@@ -2905,6 +2625,7 @@
                 <w:szCs w:val="20"/>
                 <w:highlight w:val="yellow"/>
               </w:rPr>
+              <w:lastRenderedPageBreak/>
               <w:t>T5:</w:t>
             </w:r>
             <w:r>
@@ -3191,19 +2912,8 @@
                 <w:szCs w:val="20"/>
                 <w:highlight w:val="yellow"/>
               </w:rPr>
-              <w:t xml:space="preserve"> in </w:t>
-            </w:r>
-            <w:proofErr w:type="spellStart"/>
-            <w:r>
-              <w:rPr>
-                <w:color w:val="0000FF"/>
-                <w:sz w:val="20"/>
-                <w:szCs w:val="20"/>
-                <w:highlight w:val="yellow"/>
-              </w:rPr>
-              <w:t>graph.c</w:t>
-            </w:r>
-            <w:proofErr w:type="spellEnd"/>
+              <w:t xml:space="preserve"> in graph.c</w:t>
+            </w:r>
           </w:p>
           <w:p>
             <w:pPr>
@@ -3570,7 +3280,7 @@
                 <w:szCs w:val="20"/>
                 <w:highlight w:val="yellow"/>
               </w:rPr>
-              <w:t>:</w:t>
+              <w:t>dataStruct.c</w:t>
             </w:r>
           </w:p>
         </w:tc>
@@ -3596,7 +3306,18 @@
                 <w:szCs w:val="20"/>
                 <w:highlight w:val="yellow"/>
               </w:rPr>
-              <w:t>:</w:t>
+              <w:t xml:space="preserve">Source file that contains the stack and queue </w:t>
+            </w:r>
+            <w:r>
+              <w:rPr>
+                <w:rFonts w:ascii="Courier New" w:eastAsia="Courier New" w:hAnsi="Courier New" w:cs="Courier New"/>
+                <w:b/>
+                <w:bCs/>
+                <w:sz w:val="20"/>
+                <w:szCs w:val="20"/>
+                <w:highlight w:val="yellow"/>
+              </w:rPr>
+              <w:t>data structure and functions</w:t>
             </w:r>
           </w:p>
         </w:tc>
@@ -3627,7 +3348,7 @@
                 <w:szCs w:val="20"/>
                 <w:highlight w:val="yellow"/>
               </w:rPr>
-              <w:t>:</w:t>
+              <w:t>dataStruct.h</w:t>
             </w:r>
           </w:p>
         </w:tc>
@@ -3653,7 +3374,7 @@
                 <w:szCs w:val="20"/>
                 <w:highlight w:val="yellow"/>
               </w:rPr>
-              <w:t>:</w:t>
+              <w:t>Header file for dataStruct.c</w:t>
             </w:r>
           </w:p>
         </w:tc>
@@ -3684,7 +3405,7 @@
                 <w:szCs w:val="20"/>
                 <w:highlight w:val="yellow"/>
               </w:rPr>
-              <w:t>:</w:t>
+              <w:t>graph.c</w:t>
             </w:r>
           </w:p>
         </w:tc>
@@ -3710,7 +3431,7 @@
                 <w:szCs w:val="20"/>
                 <w:highlight w:val="yellow"/>
               </w:rPr>
-              <w:t>:</w:t>
+              <w:t>Source file that contains the graph data structure</w:t>
             </w:r>
           </w:p>
         </w:tc>
@@ -3741,7 +3462,7 @@
                 <w:szCs w:val="20"/>
                 <w:highlight w:val="yellow"/>
               </w:rPr>
-              <w:t>:</w:t>
+              <w:t>graph.h</w:t>
             </w:r>
           </w:p>
         </w:tc>
@@ -3767,7 +3488,7 @@
                 <w:szCs w:val="20"/>
                 <w:highlight w:val="yellow"/>
               </w:rPr>
-              <w:t>:</w:t>
+              <w:t>Header file for graph.c</w:t>
             </w:r>
           </w:p>
         </w:tc>
@@ -3798,7 +3519,7 @@
                 <w:szCs w:val="20"/>
                 <w:highlight w:val="yellow"/>
               </w:rPr>
-              <w:t>:</w:t>
+              <w:t>traversal.c</w:t>
             </w:r>
           </w:p>
         </w:tc>
@@ -3824,7 +3545,7 @@
                 <w:szCs w:val="20"/>
                 <w:highlight w:val="yellow"/>
               </w:rPr>
-              <w:t>:</w:t>
+              <w:t>Source file that contains the implementation codes for graph traversals</w:t>
             </w:r>
           </w:p>
         </w:tc>
@@ -3855,7 +3576,7 @@
                 <w:szCs w:val="20"/>
                 <w:highlight w:val="yellow"/>
               </w:rPr>
-              <w:t>:</w:t>
+              <w:t>traversal.h</w:t>
             </w:r>
           </w:p>
         </w:tc>
@@ -3881,7 +3602,7 @@
                 <w:szCs w:val="20"/>
                 <w:highlight w:val="yellow"/>
               </w:rPr>
-              <w:t>:</w:t>
+              <w:t>Header file for traversal.c</w:t>
             </w:r>
           </w:p>
         </w:tc>
@@ -3912,7 +3633,269 @@
                 <w:szCs w:val="20"/>
                 <w:highlight w:val="yellow"/>
               </w:rPr>
-              <w:t>GROUPNUMBER.PDF</w:t>
+              <w:t>m</w:t>
+            </w:r>
+            <w:r>
+              <w:rPr>
+                <w:rFonts w:ascii="Courier New" w:eastAsia="Courier New" w:hAnsi="Courier New" w:cs="Courier New"/>
+                <w:b/>
+                <w:bCs/>
+                <w:sz w:val="20"/>
+                <w:szCs w:val="20"/>
+                <w:highlight w:val="yellow"/>
+              </w:rPr>
+              <w:t>ain.c</w:t>
+            </w:r>
+          </w:p>
+        </w:tc>
+        <w:tc>
+          <w:tcPr>
+            <w:tcW w:w="7410" w:type="dxa"/>
+          </w:tcPr>
+          <w:p>
+            <w:pPr>
+              <w:spacing w:after="30"/>
+              <w:rPr>
+                <w:rFonts w:ascii="Courier New" w:eastAsia="Courier New" w:hAnsi="Courier New" w:cs="Courier New"/>
+                <w:b/>
+                <w:bCs/>
+                <w:sz w:val="20"/>
+                <w:szCs w:val="20"/>
+                <w:highlight w:val="yellow"/>
+              </w:rPr>
+            </w:pPr>
+            <w:r>
+              <w:rPr>
+                <w:rFonts w:ascii="Courier New" w:eastAsia="Courier New" w:hAnsi="Courier New" w:cs="Courier New"/>
+                <w:b/>
+                <w:bCs/>
+                <w:sz w:val="20"/>
+                <w:szCs w:val="20"/>
+                <w:highlight w:val="yellow"/>
+              </w:rPr>
+              <w:t>Main driver that takes in an input file and produces the 6 needed outputs</w:t>
+            </w:r>
+          </w:p>
+        </w:tc>
+      </w:tr>
+      <w:tr>
+        <w:tc>
+          <w:tcPr>
+            <w:tcW w:w="2190" w:type="dxa"/>
+          </w:tcPr>
+          <w:p>
+            <w:pPr>
+              <w:spacing w:after="30"/>
+              <w:rPr>
+                <w:rFonts w:ascii="Courier New" w:eastAsia="Courier New" w:hAnsi="Courier New" w:cs="Courier New"/>
+                <w:b/>
+                <w:bCs/>
+                <w:sz w:val="20"/>
+                <w:szCs w:val="20"/>
+                <w:highlight w:val="yellow"/>
+              </w:rPr>
+            </w:pPr>
+            <w:r>
+              <w:rPr>
+                <w:rFonts w:ascii="Courier New" w:eastAsia="Courier New" w:hAnsi="Courier New" w:cs="Courier New"/>
+                <w:b/>
+                <w:bCs/>
+                <w:sz w:val="20"/>
+                <w:szCs w:val="20"/>
+                <w:highlight w:val="yellow"/>
+              </w:rPr>
+              <w:t>B.TXT</w:t>
+            </w:r>
+          </w:p>
+        </w:tc>
+        <w:tc>
+          <w:tcPr>
+            <w:tcW w:w="7410" w:type="dxa"/>
+          </w:tcPr>
+          <w:p>
+            <w:pPr>
+              <w:spacing w:after="30"/>
+              <w:rPr>
+                <w:rFonts w:ascii="Courier New" w:eastAsia="Courier New" w:hAnsi="Courier New" w:cs="Courier New"/>
+                <w:b/>
+                <w:bCs/>
+                <w:sz w:val="20"/>
+                <w:szCs w:val="20"/>
+                <w:highlight w:val="yellow"/>
+              </w:rPr>
+            </w:pPr>
+            <w:r>
+              <w:rPr>
+                <w:rFonts w:ascii="Courier New" w:eastAsia="Courier New" w:hAnsi="Courier New" w:cs="Courier New"/>
+                <w:b/>
+                <w:bCs/>
+                <w:sz w:val="20"/>
+                <w:szCs w:val="20"/>
+                <w:highlight w:val="yellow"/>
+              </w:rPr>
+              <w:t>Input file with 20 vertices</w:t>
+            </w:r>
+          </w:p>
+        </w:tc>
+      </w:tr>
+      <w:tr>
+        <w:tc>
+          <w:tcPr>
+            <w:tcW w:w="2190" w:type="dxa"/>
+          </w:tcPr>
+          <w:p>
+            <w:pPr>
+              <w:spacing w:after="30"/>
+              <w:rPr>
+                <w:rFonts w:ascii="Courier New" w:eastAsia="Courier New" w:hAnsi="Courier New" w:cs="Courier New"/>
+                <w:b/>
+                <w:bCs/>
+                <w:sz w:val="20"/>
+                <w:szCs w:val="20"/>
+                <w:highlight w:val="yellow"/>
+              </w:rPr>
+            </w:pPr>
+            <w:r>
+              <w:rPr>
+                <w:rFonts w:ascii="Courier New" w:eastAsia="Courier New" w:hAnsi="Courier New" w:cs="Courier New"/>
+                <w:b/>
+                <w:bCs/>
+                <w:sz w:val="20"/>
+                <w:szCs w:val="20"/>
+                <w:highlight w:val="yellow"/>
+              </w:rPr>
+              <w:t>G.TXT</w:t>
+            </w:r>
+          </w:p>
+        </w:tc>
+        <w:tc>
+          <w:tcPr>
+            <w:tcW w:w="7410" w:type="dxa"/>
+          </w:tcPr>
+          <w:p>
+            <w:pPr>
+              <w:spacing w:after="30"/>
+              <w:rPr>
+                <w:rFonts w:ascii="Courier New" w:eastAsia="Courier New" w:hAnsi="Courier New" w:cs="Courier New"/>
+                <w:b/>
+                <w:bCs/>
+                <w:sz w:val="20"/>
+                <w:szCs w:val="20"/>
+                <w:highlight w:val="yellow"/>
+              </w:rPr>
+            </w:pPr>
+            <w:r>
+              <w:rPr>
+                <w:rFonts w:ascii="Courier New" w:eastAsia="Courier New" w:hAnsi="Courier New" w:cs="Courier New"/>
+                <w:b/>
+                <w:bCs/>
+                <w:sz w:val="20"/>
+                <w:szCs w:val="20"/>
+                <w:highlight w:val="yellow"/>
+              </w:rPr>
+              <w:t>Input file with 5 vertices</w:t>
+            </w:r>
+          </w:p>
+        </w:tc>
+      </w:tr>
+      <w:tr>
+        <w:tc>
+          <w:tcPr>
+            <w:tcW w:w="2190" w:type="dxa"/>
+          </w:tcPr>
+          <w:p>
+            <w:pPr>
+              <w:spacing w:after="30"/>
+              <w:rPr>
+                <w:rFonts w:ascii="Courier New" w:eastAsia="Courier New" w:hAnsi="Courier New" w:cs="Courier New"/>
+                <w:b/>
+                <w:bCs/>
+                <w:sz w:val="20"/>
+                <w:szCs w:val="20"/>
+                <w:highlight w:val="yellow"/>
+              </w:rPr>
+            </w:pPr>
+            <w:r>
+              <w:rPr>
+                <w:rFonts w:ascii="Courier New" w:eastAsia="Courier New" w:hAnsi="Courier New" w:cs="Courier New"/>
+                <w:b/>
+                <w:bCs/>
+                <w:sz w:val="20"/>
+                <w:szCs w:val="20"/>
+                <w:highlight w:val="yellow"/>
+              </w:rPr>
+              <w:t>Z.TXT</w:t>
+            </w:r>
+          </w:p>
+        </w:tc>
+        <w:tc>
+          <w:tcPr>
+            <w:tcW w:w="7410" w:type="dxa"/>
+          </w:tcPr>
+          <w:p>
+            <w:pPr>
+              <w:spacing w:after="30"/>
+              <w:rPr>
+                <w:rFonts w:ascii="Courier New" w:eastAsia="Courier New" w:hAnsi="Courier New" w:cs="Courier New"/>
+                <w:b/>
+                <w:bCs/>
+                <w:sz w:val="20"/>
+                <w:szCs w:val="20"/>
+                <w:highlight w:val="yellow"/>
+              </w:rPr>
+            </w:pPr>
+            <w:r>
+              <w:rPr>
+                <w:rFonts w:ascii="Courier New" w:eastAsia="Courier New" w:hAnsi="Courier New" w:cs="Courier New"/>
+                <w:b/>
+                <w:bCs/>
+                <w:sz w:val="20"/>
+                <w:szCs w:val="20"/>
+                <w:highlight w:val="yellow"/>
+              </w:rPr>
+              <w:t>Input file with 10 vertices</w:t>
+            </w:r>
+          </w:p>
+        </w:tc>
+      </w:tr>
+      <w:tr>
+        <w:tc>
+          <w:tcPr>
+            <w:tcW w:w="2190" w:type="dxa"/>
+          </w:tcPr>
+          <w:p>
+            <w:pPr>
+              <w:spacing w:after="30"/>
+              <w:rPr>
+                <w:rFonts w:ascii="Courier New" w:eastAsia="Courier New" w:hAnsi="Courier New" w:cs="Courier New"/>
+                <w:b/>
+                <w:bCs/>
+                <w:sz w:val="20"/>
+                <w:szCs w:val="20"/>
+                <w:highlight w:val="yellow"/>
+              </w:rPr>
+            </w:pPr>
+            <w:r>
+              <w:rPr>
+                <w:rFonts w:ascii="Courier New" w:eastAsia="Courier New" w:hAnsi="Courier New" w:cs="Courier New"/>
+                <w:b/>
+                <w:bCs/>
+                <w:sz w:val="20"/>
+                <w:szCs w:val="20"/>
+                <w:highlight w:val="yellow"/>
+              </w:rPr>
+              <w:t>18</w:t>
+            </w:r>
+            <w:r>
+              <w:rPr>
+                <w:rFonts w:ascii="Courier New" w:eastAsia="Courier New" w:hAnsi="Courier New" w:cs="Courier New"/>
+                <w:b/>
+                <w:bCs/>
+                <w:sz w:val="20"/>
+                <w:szCs w:val="20"/>
+                <w:highlight w:val="yellow"/>
+              </w:rPr>
+              <w:t>.PDF</w:t>
             </w:r>
           </w:p>
         </w:tc>
@@ -4051,6 +4034,7 @@
     <w:p>
       <w:pPr>
         <w:spacing w:after="30"/>
+        <w:ind w:left="720"/>
         <w:jc w:val="both"/>
         <w:rPr>
           <w:b/>
@@ -4064,9 +4048,8 @@
           <w:sz w:val="20"/>
           <w:szCs w:val="20"/>
         </w:rPr>
-        <w:t xml:space="preserve">               C:\MCO2&gt; </w:t>
-      </w:r>
-      <w:proofErr w:type="spellStart"/>
+        <w:t xml:space="preserve">C:\MCO2&gt; </w:t>
+      </w:r>
       <w:r>
         <w:rPr>
           <w:b/>
@@ -4075,40 +4058,7 @@
           <w:szCs w:val="20"/>
           <w:highlight w:val="yellow"/>
         </w:rPr>
-        <w:t>gcc</w:t>
-      </w:r>
-      <w:proofErr w:type="spellEnd"/>
-      <w:r>
-        <w:rPr>
-          <w:b/>
-          <w:bCs/>
-          <w:sz w:val="20"/>
-          <w:szCs w:val="20"/>
-          <w:highlight w:val="yellow"/>
-        </w:rPr>
-        <w:t xml:space="preserve"> -Wall </w:t>
-      </w:r>
-      <w:proofErr w:type="spellStart"/>
-      <w:r>
-        <w:rPr>
-          <w:b/>
-          <w:bCs/>
-          <w:sz w:val="20"/>
-          <w:szCs w:val="20"/>
-          <w:highlight w:val="yellow"/>
-        </w:rPr>
-        <w:t>main.c</w:t>
-      </w:r>
-      <w:proofErr w:type="spellEnd"/>
-      <w:r>
-        <w:rPr>
-          <w:b/>
-          <w:bCs/>
-          <w:sz w:val="20"/>
-          <w:szCs w:val="20"/>
-          <w:highlight w:val="yellow"/>
-        </w:rPr>
-        <w:t xml:space="preserve"> -o main.exe</w:t>
+        <w:t>gcc -Wall main.c -o main.exe</w:t>
       </w:r>
     </w:p>
     <w:p>
@@ -4152,6 +4102,7 @@
     <w:p>
       <w:pPr>
         <w:spacing w:after="30"/>
+        <w:ind w:left="720"/>
         <w:jc w:val="both"/>
         <w:rPr>
           <w:b/>
@@ -4165,7 +4116,7 @@
           <w:sz w:val="20"/>
           <w:szCs w:val="20"/>
         </w:rPr>
-        <w:t xml:space="preserve">               C:\MCO2&gt;</w:t>
+        <w:t>C:\MCO2&gt;</w:t>
       </w:r>
       <w:r>
         <w:rPr>
@@ -4232,6 +4183,7 @@
           <w:sz w:val="20"/>
           <w:szCs w:val="20"/>
         </w:rPr>
+        <w:lastRenderedPageBreak/>
         <w:t xml:space="preserve">Is there a compilation (syntax error) in your codes? (YES or NO). </w:t>
       </w:r>
       <w:r>
@@ -4378,25 +4330,7 @@
           <w:sz w:val="20"/>
           <w:szCs w:val="20"/>
         </w:rPr>
-        <w:t xml:space="preserve">WARNING: there will be a </w:t>
-      </w:r>
-      <w:proofErr w:type="gramStart"/>
-      <w:r>
-        <w:rPr>
-          <w:color w:val="FF0000"/>
-          <w:sz w:val="20"/>
-          <w:szCs w:val="20"/>
-        </w:rPr>
-        <w:t>1 point</w:t>
-      </w:r>
-      <w:proofErr w:type="gramEnd"/>
-      <w:r>
-        <w:rPr>
-          <w:color w:val="FF0000"/>
-          <w:sz w:val="20"/>
-          <w:szCs w:val="20"/>
-        </w:rPr>
-        <w:t xml:space="preserve"> deduction for every unique compiler warning.  Please make sure that your submission does not have a compiler warning.</w:t>
+        <w:t>WARNING: there will be a 1 point deduction for every unique compiler warning.  Please make sure that your submission does not have a compiler warning.</w:t>
       </w:r>
     </w:p>
     <w:p>
@@ -4503,23 +4437,13 @@
       <w:r>
         <w:t xml:space="preserve">MCO2&gt; </w:t>
       </w:r>
-      <w:proofErr w:type="spellStart"/>
       <w:r>
         <w:rPr>
           <w:b/>
           <w:bCs/>
           <w:highlight w:val="yellow"/>
         </w:rPr>
-        <w:t>gcc</w:t>
-      </w:r>
-      <w:proofErr w:type="spellEnd"/>
-      <w:r>
-        <w:rPr>
-          <w:b/>
-          <w:bCs/>
-          <w:highlight w:val="yellow"/>
-        </w:rPr>
-        <w:t xml:space="preserve"> -Wall 01-BONUS.c -o 01-BONUS.exe</w:t>
+        <w:t>gcc -Wall 01-BONUS.c -o 01-BONUS.exe</w:t>
       </w:r>
     </w:p>
     <w:p>
@@ -4589,27 +4513,7 @@
           <w:sz w:val="20"/>
           <w:szCs w:val="20"/>
         </w:rPr>
-        <w:t>IV</w:t>
-      </w:r>
-      <w:proofErr w:type="gramStart"/>
-      <w:r>
-        <w:rPr>
-          <w:b/>
-          <w:bCs/>
-          <w:sz w:val="20"/>
-          <w:szCs w:val="20"/>
-        </w:rPr>
-        <w:t>.  DISCLOSURE</w:t>
-      </w:r>
-      <w:proofErr w:type="gramEnd"/>
-      <w:r>
-        <w:rPr>
-          <w:b/>
-          <w:bCs/>
-          <w:sz w:val="20"/>
-          <w:szCs w:val="20"/>
-        </w:rPr>
-        <w:t xml:space="preserve"> OF ERROR(S)</w:t>
+        <w:t>IV.  DISCLOSURE OF ERROR(S)</w:t>
       </w:r>
     </w:p>
     <w:p>
@@ -4659,25 +4563,7 @@
           <w:sz w:val="20"/>
           <w:szCs w:val="20"/>
         </w:rPr>
-        <w:t xml:space="preserve">  Explain briefly the reason why your group </w:t>
-      </w:r>
-      <w:proofErr w:type="gramStart"/>
-      <w:r>
-        <w:rPr>
-          <w:color w:val="999999"/>
-          <w:sz w:val="20"/>
-          <w:szCs w:val="20"/>
-        </w:rPr>
-        <w:t>was not able to</w:t>
-      </w:r>
-      <w:proofErr w:type="gramEnd"/>
-      <w:r>
-        <w:rPr>
-          <w:color w:val="999999"/>
-          <w:sz w:val="20"/>
-          <w:szCs w:val="20"/>
-        </w:rPr>
-        <w:t xml:space="preserve"> make it work.</w:t>
+        <w:t xml:space="preserve">  Explain briefly the reason why your group was not able to make it work.</w:t>
       </w:r>
     </w:p>
     <w:p>
@@ -4711,6 +4597,11 @@
     </w:p>
     <w:p>
       <w:pPr>
+        <w:pStyle w:val="ListParagraph"/>
+        <w:numPr>
+          <w:ilvl w:val="3"/>
+          <w:numId w:val="5"/>
+        </w:numPr>
         <w:spacing w:after="30"/>
         <w:rPr>
           <w:color w:val="0000FF"/>
@@ -4726,66 +4617,37 @@
           <w:szCs w:val="20"/>
           <w:highlight w:val="yellow"/>
         </w:rPr>
-        <w:t>a.</w:t>
-      </w:r>
-      <w:r>
+        <w:t>N/A</w:t>
+      </w:r>
+    </w:p>
+    <w:p>
+      <w:pPr>
+        <w:spacing w:after="30"/>
+        <w:rPr>
+          <w:sz w:val="20"/>
+          <w:szCs w:val="20"/>
+          <w:highlight w:val="yellow"/>
+        </w:rPr>
+      </w:pPr>
+    </w:p>
+    <w:p>
+      <w:pPr>
+        <w:spacing w:after="30"/>
         <w:rPr>
           <w:color w:val="0000FF"/>
           <w:sz w:val="20"/>
           <w:szCs w:val="20"/>
           <w:highlight w:val="yellow"/>
         </w:rPr>
-        <w:t xml:space="preserve"> N/A</w:t>
-      </w:r>
-    </w:p>
-    <w:p>
-      <w:pPr>
-        <w:spacing w:after="30"/>
-        <w:rPr>
+      </w:pPr>
+      <w:r>
+        <w:rPr>
+          <w:color w:val="0000FF"/>
           <w:sz w:val="20"/>
           <w:szCs w:val="20"/>
           <w:highlight w:val="yellow"/>
         </w:rPr>
-      </w:pPr>
-    </w:p>
-    <w:p>
-      <w:pPr>
-        <w:spacing w:after="30"/>
-        <w:rPr>
-          <w:color w:val="0000FF"/>
-          <w:sz w:val="20"/>
-          <w:szCs w:val="20"/>
-          <w:highlight w:val="yellow"/>
-        </w:rPr>
-      </w:pPr>
-      <w:r>
-        <w:rPr>
-          <w:color w:val="0000FF"/>
-          <w:sz w:val="20"/>
-          <w:szCs w:val="20"/>
-          <w:highlight w:val="yellow"/>
-        </w:rPr>
-        <w:t xml:space="preserve">We </w:t>
-      </w:r>
-      <w:proofErr w:type="gramStart"/>
-      <w:r>
-        <w:rPr>
-          <w:color w:val="0000FF"/>
-          <w:sz w:val="20"/>
-          <w:szCs w:val="20"/>
-          <w:highlight w:val="yellow"/>
-        </w:rPr>
-        <w:t>were not able to</w:t>
-      </w:r>
-      <w:proofErr w:type="gramEnd"/>
-      <w:r>
-        <w:rPr>
-          <w:color w:val="0000FF"/>
-          <w:sz w:val="20"/>
-          <w:szCs w:val="20"/>
-          <w:highlight w:val="yellow"/>
-        </w:rPr>
-        <w:t xml:space="preserve"> make them work because:</w:t>
+        <w:t>We were not able to make them work because:</w:t>
       </w:r>
     </w:p>
     <w:p>
@@ -4897,15 +4759,7 @@
               <w:spacing w:after="30"/>
             </w:pPr>
             <w:r>
-              <w:t>1</w:t>
-            </w:r>
-            <w:proofErr w:type="gramStart"/>
-            <w:r>
-              <w:t>.  How</w:t>
-            </w:r>
-            <w:proofErr w:type="gramEnd"/>
-            <w:r>
-              <w:t xml:space="preserve"> did you implement your Graph data structure? Did you implement it using an Adjacency Matrix or Adjacency List or both? What is the reason behind your choice of graph data structure implementation? Explain briefly (at most 5 sentences).</w:t>
+              <w:t>1.  How did you implement your Graph data structure? Did you implement it using an Adjacency Matrix or Adjacency List or both? What is the reason behind your choice of graph data structure implementation? Explain briefly (at most 5 sentences).</w:t>
             </w:r>
           </w:p>
           <w:p>
@@ -4922,10 +4776,16 @@
             </w:pPr>
             <w:r>
               <w:rPr>
+                <w:highlight w:val="yellow"/>
                 <w:u w:val="single"/>
               </w:rPr>
               <w:t>We chose adjacency matrix because it was easier to visualize the relationship between all vertices. Since with a matrix it is much easier to map who is adjacent with whom using 0 as false and 1 as true. While also assigning a row or column for each vertex based on the order they are read from the .txt file.</w:t>
             </w:r>
+          </w:p>
+          <w:p>
+            <w:pPr>
+              <w:spacing w:after="30"/>
+            </w:pPr>
           </w:p>
         </w:tc>
       </w:tr>
@@ -5033,7 +4893,6 @@
               <w:spacing w:after="30"/>
             </w:pPr>
             <w:r>
-              <w:lastRenderedPageBreak/>
               <w:t xml:space="preserve"> </w:t>
             </w:r>
           </w:p>
@@ -5081,27 +4940,7 @@
           <w:sz w:val="20"/>
           <w:szCs w:val="20"/>
         </w:rPr>
-        <w:t>VI</w:t>
-      </w:r>
-      <w:proofErr w:type="gramStart"/>
-      <w:r>
-        <w:rPr>
-          <w:b/>
-          <w:bCs/>
-          <w:sz w:val="20"/>
-          <w:szCs w:val="20"/>
-        </w:rPr>
-        <w:t>.  SELF</w:t>
-      </w:r>
-      <w:proofErr w:type="gramEnd"/>
-      <w:r>
-        <w:rPr>
-          <w:b/>
-          <w:bCs/>
-          <w:sz w:val="20"/>
-          <w:szCs w:val="20"/>
-        </w:rPr>
-        <w:t>-EVALUATION</w:t>
+        <w:t>VI.  SELF-EVALUATION</w:t>
       </w:r>
     </w:p>
     <w:p>
@@ -5330,23 +5169,7 @@
                 <w:sz w:val="20"/>
                 <w:szCs w:val="20"/>
               </w:rPr>
-              <w:t xml:space="preserve">  </w:t>
-            </w:r>
-            <w:proofErr w:type="gramStart"/>
-            <w:r>
-              <w:rPr>
-                <w:sz w:val="20"/>
-                <w:szCs w:val="20"/>
-              </w:rPr>
-              <w:t xml:space="preserve">   (</w:t>
-            </w:r>
-            <w:proofErr w:type="gramEnd"/>
-            <w:r>
-              <w:rPr>
-                <w:sz w:val="20"/>
-                <w:szCs w:val="20"/>
-              </w:rPr>
-              <w:t>max. 10 points)</w:t>
+              <w:t>     (max. 10 points)</w:t>
             </w:r>
           </w:p>
         </w:tc>
@@ -5377,15 +5200,7 @@
               <w:t xml:space="preserve">2. </w:t>
             </w:r>
             <w:r>
-              <w:t xml:space="preserve">Output Text File #2 (Vertices </w:t>
-            </w:r>
-            <w:proofErr w:type="gramStart"/>
-            <w:r>
-              <w:t>With</w:t>
-            </w:r>
-            <w:proofErr w:type="gramEnd"/>
-            <w:r>
-              <w:t xml:space="preserve"> Degrees)</w:t>
+              <w:t>Output Text File #2 (Vertices With Degrees)</w:t>
             </w:r>
           </w:p>
         </w:tc>
@@ -5437,23 +5252,7 @@
                 <w:sz w:val="20"/>
                 <w:szCs w:val="20"/>
               </w:rPr>
-              <w:t xml:space="preserve">  </w:t>
-            </w:r>
-            <w:proofErr w:type="gramStart"/>
-            <w:r>
-              <w:rPr>
-                <w:sz w:val="20"/>
-                <w:szCs w:val="20"/>
-              </w:rPr>
-              <w:t xml:space="preserve">   (</w:t>
-            </w:r>
-            <w:proofErr w:type="gramEnd"/>
-            <w:r>
-              <w:rPr>
-                <w:sz w:val="20"/>
-                <w:szCs w:val="20"/>
-              </w:rPr>
-              <w:t>max. 10 points)</w:t>
+              <w:t>     (max. 10 points)</w:t>
             </w:r>
           </w:p>
         </w:tc>
@@ -5535,23 +5334,7 @@
                 <w:sz w:val="20"/>
                 <w:szCs w:val="20"/>
               </w:rPr>
-              <w:t xml:space="preserve">  </w:t>
-            </w:r>
-            <w:proofErr w:type="gramStart"/>
-            <w:r>
-              <w:rPr>
-                <w:sz w:val="20"/>
-                <w:szCs w:val="20"/>
-              </w:rPr>
-              <w:t xml:space="preserve">   (</w:t>
-            </w:r>
-            <w:proofErr w:type="gramEnd"/>
-            <w:r>
-              <w:rPr>
-                <w:sz w:val="20"/>
-                <w:szCs w:val="20"/>
-              </w:rPr>
-              <w:t>max. 12.5 points)</w:t>
+              <w:t>     (max. 12.5 points)</w:t>
             </w:r>
           </w:p>
         </w:tc>
@@ -5631,23 +5414,7 @@
                 <w:sz w:val="20"/>
                 <w:szCs w:val="20"/>
               </w:rPr>
-              <w:t xml:space="preserve">  </w:t>
-            </w:r>
-            <w:proofErr w:type="gramStart"/>
-            <w:r>
-              <w:rPr>
-                <w:sz w:val="20"/>
-                <w:szCs w:val="20"/>
-              </w:rPr>
-              <w:t xml:space="preserve">   (</w:t>
-            </w:r>
-            <w:proofErr w:type="gramEnd"/>
-            <w:r>
-              <w:rPr>
-                <w:sz w:val="20"/>
-                <w:szCs w:val="20"/>
-              </w:rPr>
-              <w:t>max. 12.5 points)</w:t>
+              <w:t>     (max. 12.5 points)</w:t>
             </w:r>
           </w:p>
         </w:tc>
@@ -5729,23 +5496,7 @@
                 <w:sz w:val="20"/>
                 <w:szCs w:val="20"/>
               </w:rPr>
-              <w:t xml:space="preserve">  </w:t>
-            </w:r>
-            <w:proofErr w:type="gramStart"/>
-            <w:r>
-              <w:rPr>
-                <w:sz w:val="20"/>
-                <w:szCs w:val="20"/>
-              </w:rPr>
-              <w:t xml:space="preserve">   (</w:t>
-            </w:r>
-            <w:proofErr w:type="gramEnd"/>
-            <w:r>
-              <w:rPr>
-                <w:sz w:val="20"/>
-                <w:szCs w:val="20"/>
-              </w:rPr>
-              <w:t>max. 20 points)</w:t>
+              <w:t>     (max. 20 points)</w:t>
             </w:r>
           </w:p>
         </w:tc>
@@ -5827,23 +5578,7 @@
                 <w:sz w:val="20"/>
                 <w:szCs w:val="20"/>
               </w:rPr>
-              <w:t xml:space="preserve">  </w:t>
-            </w:r>
-            <w:proofErr w:type="gramStart"/>
-            <w:r>
-              <w:rPr>
-                <w:sz w:val="20"/>
-                <w:szCs w:val="20"/>
-              </w:rPr>
-              <w:t xml:space="preserve">   (</w:t>
-            </w:r>
-            <w:proofErr w:type="gramEnd"/>
-            <w:r>
-              <w:rPr>
-                <w:sz w:val="20"/>
-                <w:szCs w:val="20"/>
-              </w:rPr>
-              <w:t>max. 20 points)</w:t>
+              <w:t>     (max. 20 points)</w:t>
             </w:r>
           </w:p>
         </w:tc>
@@ -5925,23 +5660,7 @@
                 <w:sz w:val="20"/>
                 <w:szCs w:val="20"/>
               </w:rPr>
-              <w:t xml:space="preserve">  </w:t>
-            </w:r>
-            <w:proofErr w:type="gramStart"/>
-            <w:r>
-              <w:rPr>
-                <w:sz w:val="20"/>
-                <w:szCs w:val="20"/>
-              </w:rPr>
-              <w:t xml:space="preserve">   (</w:t>
-            </w:r>
-            <w:proofErr w:type="gramEnd"/>
-            <w:r>
-              <w:rPr>
-                <w:sz w:val="20"/>
-                <w:szCs w:val="20"/>
-              </w:rPr>
-              <w:t>max. 10 points)</w:t>
+              <w:t>     (max. 10 points)</w:t>
             </w:r>
           </w:p>
         </w:tc>
@@ -6023,23 +5742,7 @@
                 <w:sz w:val="20"/>
                 <w:szCs w:val="20"/>
               </w:rPr>
-              <w:t xml:space="preserve">  </w:t>
-            </w:r>
-            <w:proofErr w:type="gramStart"/>
-            <w:r>
-              <w:rPr>
-                <w:sz w:val="20"/>
-                <w:szCs w:val="20"/>
-              </w:rPr>
-              <w:t xml:space="preserve">   (</w:t>
-            </w:r>
-            <w:proofErr w:type="gramEnd"/>
-            <w:r>
-              <w:rPr>
-                <w:sz w:val="20"/>
-                <w:szCs w:val="20"/>
-              </w:rPr>
-              <w:t>max. 5 points)</w:t>
+              <w:t>     (max. 5 points)</w:t>
             </w:r>
           </w:p>
         </w:tc>
@@ -6110,7 +5813,7 @@
                 <w:highlight w:val="yellow"/>
                 <w:u w:val="single"/>
               </w:rPr>
-              <w:t>10</w:t>
+              <w:t>0</w:t>
             </w:r>
             <w:r>
               <w:rPr>
@@ -6127,23 +5830,7 @@
                 <w:sz w:val="20"/>
                 <w:szCs w:val="20"/>
               </w:rPr>
-              <w:t xml:space="preserve">  </w:t>
-            </w:r>
-            <w:proofErr w:type="gramStart"/>
-            <w:r>
-              <w:rPr>
-                <w:sz w:val="20"/>
-                <w:szCs w:val="20"/>
-              </w:rPr>
-              <w:t xml:space="preserve">   (</w:t>
-            </w:r>
-            <w:proofErr w:type="gramEnd"/>
-            <w:r>
-              <w:rPr>
-                <w:sz w:val="20"/>
-                <w:szCs w:val="20"/>
-              </w:rPr>
-              <w:t>max. 10 points)</w:t>
+              <w:t>     (max. 10 points)</w:t>
             </w:r>
           </w:p>
         </w:tc>
@@ -6338,7 +6025,6 @@
         </w:rPr>
         <w:t xml:space="preserve">                                                                                                       </w:t>
       </w:r>
-      <w:proofErr w:type="spellStart"/>
       <w:r>
         <w:rPr>
           <w:rFonts w:ascii="MS Gothic" w:eastAsia="MS Gothic" w:hAnsi="MS Gothic" w:cs="MS Gothic"/>
@@ -6352,7 +6038,6 @@
         </w:rPr>
         <w:t>サルバド</w:t>
       </w:r>
-      <w:proofErr w:type="spellEnd"/>
       <w:r>
         <w:rPr>
           <w:rFonts w:ascii="Helvetica Neue" w:eastAsia="Helvetica Neue" w:hAnsi="Helvetica Neue" w:cs="Helvetica Neue"/>
@@ -6366,7 +6051,6 @@
         </w:rPr>
         <w:t>-</w:t>
       </w:r>
-      <w:proofErr w:type="spellStart"/>
       <w:r>
         <w:rPr>
           <w:rFonts w:ascii="MS Gothic" w:eastAsia="MS Gothic" w:hAnsi="MS Gothic" w:cs="MS Gothic"/>
@@ -6380,7 +6064,6 @@
         </w:rPr>
         <w:t>ル・フロランテ</w:t>
       </w:r>
-      <w:proofErr w:type="spellEnd"/>
     </w:p>
     <w:p>
       <w:pPr>
@@ -6393,7 +6076,7 @@
       </w:pPr>
     </w:p>
     <w:sectPr>
-      <w:footerReference w:type="default" r:id="rId11"/>
+      <w:footerReference w:type="default" r:id="rId12"/>
       <w:pgSz w:w="12240" w:h="15840"/>
       <w:pgMar w:top="720" w:right="720" w:bottom="720" w:left="720" w:header="708" w:footer="708" w:gutter="0"/>
       <w:pgNumType w:start="1"/>
@@ -7730,6 +7413,29 @@
       <w:contextualSpacing/>
     </w:pPr>
   </w:style>
+  <w:style w:type="character" w:styleId="Hyperlink">
+    <w:name w:val="Hyperlink"/>
+    <w:basedOn w:val="DefaultParagraphFont"/>
+    <w:uiPriority w:val="99"/>
+    <w:unhideWhenUsed/>
+    <w:rsid w:val="0084645A"/>
+    <w:rPr>
+      <w:color w:val="0000FF" w:themeColor="hyperlink"/>
+      <w:u w:val="single"/>
+    </w:rPr>
+  </w:style>
+  <w:style w:type="character" w:styleId="UnresolvedMention">
+    <w:name w:val="Unresolved Mention"/>
+    <w:basedOn w:val="DefaultParagraphFont"/>
+    <w:uiPriority w:val="99"/>
+    <w:semiHidden/>
+    <w:unhideWhenUsed/>
+    <w:rsid w:val="0084645A"/>
+    <w:rPr>
+      <w:color w:val="605E5C"/>
+      <w:shd w:val="clear" w:color="auto" w:fill="E1DFDD"/>
+    </w:rPr>
+  </w:style>
 </w:styles>
 </file>
 

</xml_diff>

<commit_message>
Fixed Output 1 & 3 ++compiler warnings :)
</commit_message>
<xml_diff>
--- a/MCO2-Documentation-18.docx
+++ b/MCO2-Documentation-18.docx
@@ -3884,18 +3884,7 @@
                 <w:szCs w:val="20"/>
                 <w:highlight w:val="yellow"/>
               </w:rPr>
-              <w:t>18</w:t>
-            </w:r>
-            <w:r>
-              <w:rPr>
-                <w:rFonts w:ascii="Courier New" w:eastAsia="Courier New" w:hAnsi="Courier New" w:cs="Courier New"/>
-                <w:b/>
-                <w:bCs/>
-                <w:sz w:val="20"/>
-                <w:szCs w:val="20"/>
-                <w:highlight w:val="yellow"/>
-              </w:rPr>
-              <w:t>.PDF</w:t>
+              <w:t>18.PDF</w:t>
             </w:r>
           </w:p>
         </w:tc>
@@ -4058,7 +4047,7 @@
           <w:szCs w:val="20"/>
           <w:highlight w:val="yellow"/>
         </w:rPr>
-        <w:t>gcc -Wall main.c -o main.exe</w:t>
+        <w:t>gcc -Wall main.c graph.c traversal.c dataStruct.c</w:t>
       </w:r>
     </w:p>
     <w:p>
@@ -4126,7 +4115,17 @@
           <w:szCs w:val="20"/>
           <w:highlight w:val="yellow"/>
         </w:rPr>
-        <w:t xml:space="preserve">main </w:t>
+        <w:t>a.exe</w:t>
+      </w:r>
+      <w:r>
+        <w:rPr>
+          <w:b/>
+          <w:bCs/>
+          <w:sz w:val="20"/>
+          <w:szCs w:val="20"/>
+          <w:highlight w:val="yellow"/>
+        </w:rPr>
+        <w:t xml:space="preserve"> </w:t>
       </w:r>
     </w:p>
     <w:p>
@@ -4776,10 +4775,9 @@
             </w:pPr>
             <w:r>
               <w:rPr>
-                <w:highlight w:val="yellow"/>
                 <w:u w:val="single"/>
               </w:rPr>
-              <w:t>We chose adjacency matrix because it was easier to visualize the relationship between all vertices. Since with a matrix it is much easier to map who is adjacent with whom using 0 as false and 1 as true. While also assigning a row or column for each vertex based on the order they are read from the .txt file.</w:t>
+              <w:t>We chose to implement both Adjacency Matrix and List because of the unique requirements for both output functions. While the matrix requires the columns that represent each vertex be in the same order as its row counterpart, meanwhile the list requires to be in the same format as its input .txt file.</w:t>
             </w:r>
           </w:p>
           <w:p>
@@ -7253,7 +7251,6 @@
   <w:style w:type="character" w:default="1" w:styleId="DefaultParagraphFont">
     <w:name w:val="Default Paragraph Font"/>
     <w:uiPriority w:val="1"/>
-    <w:semiHidden/>
     <w:unhideWhenUsed/>
   </w:style>
   <w:style w:type="table" w:default="1" w:styleId="TableNormal">

</xml_diff>

<commit_message>
Completed all inputs and outputs, updated documentation docx
</commit_message>
<xml_diff>
--- a/MCO2-Documentation-18.docx
+++ b/MCO2-Documentation-18.docx
@@ -120,7 +120,27 @@
                 <w:sz w:val="20"/>
                 <w:szCs w:val="20"/>
               </w:rPr>
-              <w:t>We declare that the project we are submitting is the product of our own work augmented with responsible and ethical use of generative AI as encoded in Table 1  and Table 2 below.</w:t>
+              <w:t xml:space="preserve">We declare that the project we are submitting is the product of our own work augmented with responsible and ethical use of generative AI as encoded in Table </w:t>
+            </w:r>
+            <w:proofErr w:type="gramStart"/>
+            <w:r>
+              <w:rPr>
+                <w:i/>
+                <w:iCs/>
+                <w:sz w:val="20"/>
+                <w:szCs w:val="20"/>
+              </w:rPr>
+              <w:t>1  and</w:t>
+            </w:r>
+            <w:proofErr w:type="gramEnd"/>
+            <w:r>
+              <w:rPr>
+                <w:i/>
+                <w:iCs/>
+                <w:sz w:val="20"/>
+                <w:szCs w:val="20"/>
+              </w:rPr>
+              <w:t xml:space="preserve"> Table 2 below.</w:t>
             </w:r>
           </w:p>
           <w:p>
@@ -322,7 +342,29 @@
                 <w:sz w:val="20"/>
                 <w:szCs w:val="20"/>
               </w:rPr>
-              <w:t>// Instruction #1: Encode your names, and affix your e-signature to attest to the declaration above.</w:t>
+              <w:t xml:space="preserve">// Instruction #1: Encode your </w:t>
+            </w:r>
+            <w:proofErr w:type="gramStart"/>
+            <w:r>
+              <w:rPr>
+                <w:b/>
+                <w:bCs/>
+                <w:color w:val="999999"/>
+                <w:sz w:val="20"/>
+                <w:szCs w:val="20"/>
+              </w:rPr>
+              <w:t>names, and</w:t>
+            </w:r>
+            <w:proofErr w:type="gramEnd"/>
+            <w:r>
+              <w:rPr>
+                <w:b/>
+                <w:bCs/>
+                <w:color w:val="999999"/>
+                <w:sz w:val="20"/>
+                <w:szCs w:val="20"/>
+              </w:rPr>
+              <w:t xml:space="preserve"> affix your e-signature to attest to the declaration above.</w:t>
             </w:r>
           </w:p>
           <w:p>
@@ -588,7 +630,29 @@
           <w:sz w:val="20"/>
           <w:szCs w:val="20"/>
         </w:rPr>
-        <w:t>// Instruction #2: Fill-up the column 2 of Table 1 below.</w:t>
+        <w:t xml:space="preserve">// Instruction #2: Fill-up </w:t>
+      </w:r>
+      <w:proofErr w:type="gramStart"/>
+      <w:r>
+        <w:rPr>
+          <w:b/>
+          <w:bCs/>
+          <w:color w:val="999999"/>
+          <w:sz w:val="20"/>
+          <w:szCs w:val="20"/>
+        </w:rPr>
+        <w:t>the column</w:t>
+      </w:r>
+      <w:proofErr w:type="gramEnd"/>
+      <w:r>
+        <w:rPr>
+          <w:b/>
+          <w:bCs/>
+          <w:color w:val="999999"/>
+          <w:sz w:val="20"/>
+          <w:szCs w:val="20"/>
+        </w:rPr>
+        <w:t xml:space="preserve"> 2 of Table 1 below.</w:t>
       </w:r>
     </w:p>
     <w:p>
@@ -1294,7 +1358,31 @@
                 <w:szCs w:val="20"/>
                 <w:highlight w:val="yellow"/>
               </w:rPr>
-              <w:t>All test cases were made by human, debugging was also done manually by human only</w:t>
+              <w:t xml:space="preserve">All test cases were made by </w:t>
+            </w:r>
+            <w:proofErr w:type="gramStart"/>
+            <w:r>
+              <w:rPr>
+                <w:i/>
+                <w:iCs/>
+                <w:color w:val="0000FF"/>
+                <w:sz w:val="20"/>
+                <w:szCs w:val="20"/>
+                <w:highlight w:val="yellow"/>
+              </w:rPr>
+              <w:t>human,</w:t>
+            </w:r>
+            <w:proofErr w:type="gramEnd"/>
+            <w:r>
+              <w:rPr>
+                <w:i/>
+                <w:iCs/>
+                <w:color w:val="0000FF"/>
+                <w:sz w:val="20"/>
+                <w:szCs w:val="20"/>
+                <w:highlight w:val="yellow"/>
+              </w:rPr>
+              <w:t xml:space="preserve"> debugging was also done manually by human only</w:t>
             </w:r>
             <w:r>
               <w:rPr>
@@ -1431,13 +1519,10 @@
           <w:sz w:val="20"/>
           <w:szCs w:val="20"/>
         </w:rPr>
-        <w:t>// Instruction #3: Fill up Table 2. List explicitly ALL AI tools that you employed, and justify their purpose/role in your project.</w:t>
-      </w:r>
-    </w:p>
-    <w:p>
-      <w:pPr>
-        <w:spacing w:after="30"/>
-        <w:jc w:val="both"/>
+        <w:t xml:space="preserve">// Instruction #3: Fill up Table 2. List explicitly ALL AI tools that you </w:t>
+      </w:r>
+      <w:proofErr w:type="gramStart"/>
+      <w:r>
         <w:rPr>
           <w:b/>
           <w:bCs/>
@@ -1445,6 +1530,31 @@
           <w:sz w:val="20"/>
           <w:szCs w:val="20"/>
         </w:rPr>
+        <w:t>employed, and</w:t>
+      </w:r>
+      <w:proofErr w:type="gramEnd"/>
+      <w:r>
+        <w:rPr>
+          <w:b/>
+          <w:bCs/>
+          <w:color w:val="999999"/>
+          <w:sz w:val="20"/>
+          <w:szCs w:val="20"/>
+        </w:rPr>
+        <w:t xml:space="preserve"> justify their purpose/role in your project.</w:t>
+      </w:r>
+    </w:p>
+    <w:p>
+      <w:pPr>
+        <w:spacing w:after="30"/>
+        <w:jc w:val="both"/>
+        <w:rPr>
+          <w:b/>
+          <w:bCs/>
+          <w:color w:val="999999"/>
+          <w:sz w:val="20"/>
+          <w:szCs w:val="20"/>
+        </w:rPr>
       </w:pPr>
     </w:p>
     <w:p>
@@ -1465,7 +1575,27 @@
           <w:sz w:val="20"/>
           <w:szCs w:val="20"/>
         </w:rPr>
-        <w:t>Table 2. List of AI Tools Used</w:t>
+        <w:t xml:space="preserve">Table 2. List of </w:t>
+      </w:r>
+      <w:proofErr w:type="gramStart"/>
+      <w:r>
+        <w:rPr>
+          <w:b/>
+          <w:bCs/>
+          <w:sz w:val="20"/>
+          <w:szCs w:val="20"/>
+        </w:rPr>
+        <w:t>AI</w:t>
+      </w:r>
+      <w:proofErr w:type="gramEnd"/>
+      <w:r>
+        <w:rPr>
+          <w:b/>
+          <w:bCs/>
+          <w:sz w:val="20"/>
+          <w:szCs w:val="20"/>
+        </w:rPr>
+        <w:t xml:space="preserve"> Tools Used</w:t>
       </w:r>
     </w:p>
     <w:tbl>
@@ -2157,7 +2287,27 @@
                 <w:szCs w:val="20"/>
                 <w:highlight w:val="yellow"/>
               </w:rPr>
-              <w:t>. Completed documentation for dataStruct.c and traversal.c</w:t>
+              <w:t xml:space="preserve">. Completed documentation for dataStruct.c and </w:t>
+            </w:r>
+            <w:proofErr w:type="gramStart"/>
+            <w:r>
+              <w:rPr>
+                <w:color w:val="0000FF"/>
+                <w:sz w:val="20"/>
+                <w:szCs w:val="20"/>
+                <w:highlight w:val="yellow"/>
+              </w:rPr>
+              <w:t>traversal</w:t>
+            </w:r>
+            <w:proofErr w:type="gramEnd"/>
+            <w:r>
+              <w:rPr>
+                <w:color w:val="0000FF"/>
+                <w:sz w:val="20"/>
+                <w:szCs w:val="20"/>
+                <w:highlight w:val="yellow"/>
+              </w:rPr>
+              <w:t>.c</w:t>
             </w:r>
           </w:p>
           <w:p>
@@ -2529,7 +2679,27 @@
                 <w:szCs w:val="20"/>
                 <w:highlight w:val="yellow"/>
               </w:rPr>
-              <w:t xml:space="preserve"> Completed the documentation within the  source code file</w:t>
+              <w:t xml:space="preserve"> Completed the documentation within </w:t>
+            </w:r>
+            <w:proofErr w:type="gramStart"/>
+            <w:r>
+              <w:rPr>
+                <w:color w:val="0000FF"/>
+                <w:sz w:val="20"/>
+                <w:szCs w:val="20"/>
+                <w:highlight w:val="yellow"/>
+              </w:rPr>
+              <w:t>the  source</w:t>
+            </w:r>
+            <w:proofErr w:type="gramEnd"/>
+            <w:r>
+              <w:rPr>
+                <w:color w:val="0000FF"/>
+                <w:sz w:val="20"/>
+                <w:szCs w:val="20"/>
+                <w:highlight w:val="yellow"/>
+              </w:rPr>
+              <w:t xml:space="preserve"> code file</w:t>
             </w:r>
             <w:r>
               <w:rPr>
@@ -3884,6 +4054,187 @@
                 <w:szCs w:val="20"/>
                 <w:highlight w:val="yellow"/>
               </w:rPr>
+              <w:t>B-SET.txt, B-DEGREE.txt, B-LIST.txt, B-MATRIX.txt, B-BFS.txt, B-DFS.txt</w:t>
+            </w:r>
+          </w:p>
+        </w:tc>
+        <w:tc>
+          <w:tcPr>
+            <w:tcW w:w="7410" w:type="dxa"/>
+          </w:tcPr>
+          <w:p>
+            <w:pPr>
+              <w:spacing w:after="30"/>
+              <w:rPr>
+                <w:rFonts w:ascii="Courier New" w:eastAsia="Courier New" w:hAnsi="Courier New" w:cs="Courier New"/>
+                <w:b/>
+                <w:bCs/>
+                <w:sz w:val="20"/>
+                <w:szCs w:val="20"/>
+                <w:highlight w:val="yellow"/>
+              </w:rPr>
+            </w:pPr>
+            <w:r>
+              <w:rPr>
+                <w:rFonts w:ascii="Courier New" w:eastAsia="Courier New" w:hAnsi="Courier New" w:cs="Courier New"/>
+                <w:b/>
+                <w:bCs/>
+                <w:sz w:val="20"/>
+                <w:szCs w:val="20"/>
+                <w:highlight w:val="yellow"/>
+              </w:rPr>
+              <w:t>All 6 output files using B.txt</w:t>
+            </w:r>
+          </w:p>
+        </w:tc>
+      </w:tr>
+      <w:tr>
+        <w:tc>
+          <w:tcPr>
+            <w:tcW w:w="2190" w:type="dxa"/>
+          </w:tcPr>
+          <w:p>
+            <w:pPr>
+              <w:spacing w:after="30"/>
+              <w:rPr>
+                <w:rFonts w:ascii="Courier New" w:eastAsia="Courier New" w:hAnsi="Courier New" w:cs="Courier New"/>
+                <w:b/>
+                <w:bCs/>
+                <w:sz w:val="20"/>
+                <w:szCs w:val="20"/>
+                <w:highlight w:val="yellow"/>
+              </w:rPr>
+            </w:pPr>
+            <w:r>
+              <w:rPr>
+                <w:rFonts w:ascii="Courier New" w:eastAsia="Courier New" w:hAnsi="Courier New" w:cs="Courier New"/>
+                <w:b/>
+                <w:bCs/>
+                <w:sz w:val="20"/>
+                <w:szCs w:val="20"/>
+                <w:highlight w:val="yellow"/>
+              </w:rPr>
+              <w:t>G-SET.txt, G-DEGREE.txt, G-LIST.txt, G-MATRIX.txt, G-BFS.txt, G-DFS.txt</w:t>
+            </w:r>
+          </w:p>
+        </w:tc>
+        <w:tc>
+          <w:tcPr>
+            <w:tcW w:w="7410" w:type="dxa"/>
+          </w:tcPr>
+          <w:p>
+            <w:pPr>
+              <w:spacing w:after="30"/>
+              <w:rPr>
+                <w:rFonts w:ascii="Courier New" w:eastAsia="Courier New" w:hAnsi="Courier New" w:cs="Courier New"/>
+                <w:b/>
+                <w:bCs/>
+                <w:sz w:val="20"/>
+                <w:szCs w:val="20"/>
+                <w:highlight w:val="yellow"/>
+              </w:rPr>
+            </w:pPr>
+            <w:r>
+              <w:rPr>
+                <w:rFonts w:ascii="Courier New" w:eastAsia="Courier New" w:hAnsi="Courier New" w:cs="Courier New"/>
+                <w:b/>
+                <w:bCs/>
+                <w:sz w:val="20"/>
+                <w:szCs w:val="20"/>
+                <w:highlight w:val="yellow"/>
+              </w:rPr>
+              <w:t>All 6 output files using G.txt</w:t>
+            </w:r>
+          </w:p>
+        </w:tc>
+      </w:tr>
+      <w:tr>
+        <w:tc>
+          <w:tcPr>
+            <w:tcW w:w="2190" w:type="dxa"/>
+          </w:tcPr>
+          <w:p>
+            <w:pPr>
+              <w:spacing w:after="30"/>
+              <w:rPr>
+                <w:rFonts w:ascii="Courier New" w:eastAsia="Courier New" w:hAnsi="Courier New" w:cs="Courier New"/>
+                <w:b/>
+                <w:bCs/>
+                <w:sz w:val="20"/>
+                <w:szCs w:val="20"/>
+                <w:highlight w:val="yellow"/>
+              </w:rPr>
+            </w:pPr>
+            <w:r>
+              <w:rPr>
+                <w:rFonts w:ascii="Courier New" w:eastAsia="Courier New" w:hAnsi="Courier New" w:cs="Courier New"/>
+                <w:b/>
+                <w:bCs/>
+                <w:sz w:val="20"/>
+                <w:szCs w:val="20"/>
+                <w:highlight w:val="yellow"/>
+              </w:rPr>
+              <w:t>Z-SET.txt, Z-DEGREE.txt, Z-LIST.txt, Z-MATRIX.txt, Z-BFS.txt, Z-DFS.txt</w:t>
+            </w:r>
+          </w:p>
+        </w:tc>
+        <w:tc>
+          <w:tcPr>
+            <w:tcW w:w="7410" w:type="dxa"/>
+          </w:tcPr>
+          <w:p>
+            <w:pPr>
+              <w:spacing w:after="30"/>
+              <w:rPr>
+                <w:rFonts w:ascii="Courier New" w:eastAsia="Courier New" w:hAnsi="Courier New" w:cs="Courier New"/>
+                <w:b/>
+                <w:bCs/>
+                <w:sz w:val="20"/>
+                <w:szCs w:val="20"/>
+                <w:highlight w:val="yellow"/>
+              </w:rPr>
+            </w:pPr>
+            <w:r>
+              <w:rPr>
+                <w:rFonts w:ascii="Courier New" w:eastAsia="Courier New" w:hAnsi="Courier New" w:cs="Courier New"/>
+                <w:b/>
+                <w:bCs/>
+                <w:sz w:val="20"/>
+                <w:szCs w:val="20"/>
+                <w:highlight w:val="yellow"/>
+              </w:rPr>
+              <w:t>All 6 output files using Z.txt</w:t>
+            </w:r>
+          </w:p>
+        </w:tc>
+      </w:tr>
+      <w:tr>
+        <w:tc>
+          <w:tcPr>
+            <w:tcW w:w="2190" w:type="dxa"/>
+          </w:tcPr>
+          <w:p>
+            <w:pPr>
+              <w:spacing w:after="30"/>
+              <w:rPr>
+                <w:rFonts w:ascii="Courier New" w:eastAsia="Courier New" w:hAnsi="Courier New" w:cs="Courier New"/>
+                <w:b/>
+                <w:bCs/>
+                <w:sz w:val="20"/>
+                <w:szCs w:val="20"/>
+                <w:highlight w:val="yellow"/>
+              </w:rPr>
+            </w:pPr>
+            <w:r>
+              <w:rPr>
+                <w:rFonts w:ascii="Courier New" w:eastAsia="Courier New" w:hAnsi="Courier New" w:cs="Courier New"/>
+                <w:b/>
+                <w:bCs/>
+                <w:sz w:val="20"/>
+                <w:szCs w:val="20"/>
+                <w:highlight w:val="yellow"/>
+              </w:rPr>
+              <w:lastRenderedPageBreak/>
               <w:t>18.PDF</w:t>
             </w:r>
           </w:p>
@@ -4182,7 +4533,6 @@
           <w:sz w:val="20"/>
           <w:szCs w:val="20"/>
         </w:rPr>
-        <w:lastRenderedPageBreak/>
         <w:t xml:space="preserve">Is there a compilation (syntax error) in your codes? (YES or NO). </w:t>
       </w:r>
       <w:r>
@@ -4329,7 +4679,25 @@
           <w:sz w:val="20"/>
           <w:szCs w:val="20"/>
         </w:rPr>
-        <w:t>WARNING: there will be a 1 point deduction for every unique compiler warning.  Please make sure that your submission does not have a compiler warning.</w:t>
+        <w:t xml:space="preserve">WARNING: there will be a </w:t>
+      </w:r>
+      <w:proofErr w:type="gramStart"/>
+      <w:r>
+        <w:rPr>
+          <w:color w:val="FF0000"/>
+          <w:sz w:val="20"/>
+          <w:szCs w:val="20"/>
+        </w:rPr>
+        <w:t>1 point</w:t>
+      </w:r>
+      <w:proofErr w:type="gramEnd"/>
+      <w:r>
+        <w:rPr>
+          <w:color w:val="FF0000"/>
+          <w:sz w:val="20"/>
+          <w:szCs w:val="20"/>
+        </w:rPr>
+        <w:t xml:space="preserve"> deduction for every unique compiler warning.  Please make sure that your submission does not have a compiler warning.</w:t>
       </w:r>
     </w:p>
     <w:p>
@@ -4512,7 +4880,27 @@
           <w:sz w:val="20"/>
           <w:szCs w:val="20"/>
         </w:rPr>
-        <w:t>IV.  DISCLOSURE OF ERROR(S)</w:t>
+        <w:t>IV</w:t>
+      </w:r>
+      <w:proofErr w:type="gramStart"/>
+      <w:r>
+        <w:rPr>
+          <w:b/>
+          <w:bCs/>
+          <w:sz w:val="20"/>
+          <w:szCs w:val="20"/>
+        </w:rPr>
+        <w:t>.  DISCLOSURE</w:t>
+      </w:r>
+      <w:proofErr w:type="gramEnd"/>
+      <w:r>
+        <w:rPr>
+          <w:b/>
+          <w:bCs/>
+          <w:sz w:val="20"/>
+          <w:szCs w:val="20"/>
+        </w:rPr>
+        <w:t xml:space="preserve"> OF ERROR(S)</w:t>
       </w:r>
     </w:p>
     <w:p>
@@ -4562,7 +4950,25 @@
           <w:sz w:val="20"/>
           <w:szCs w:val="20"/>
         </w:rPr>
-        <w:t xml:space="preserve">  Explain briefly the reason why your group was not able to make it work.</w:t>
+        <w:t xml:space="preserve">  Explain briefly the reason why your group </w:t>
+      </w:r>
+      <w:proofErr w:type="gramStart"/>
+      <w:r>
+        <w:rPr>
+          <w:color w:val="999999"/>
+          <w:sz w:val="20"/>
+          <w:szCs w:val="20"/>
+        </w:rPr>
+        <w:t>was not able to</w:t>
+      </w:r>
+      <w:proofErr w:type="gramEnd"/>
+      <w:r>
+        <w:rPr>
+          <w:color w:val="999999"/>
+          <w:sz w:val="20"/>
+          <w:szCs w:val="20"/>
+        </w:rPr>
+        <w:t xml:space="preserve"> make it work.</w:t>
       </w:r>
     </w:p>
     <w:p>
@@ -4596,11 +5002,6 @@
     </w:p>
     <w:p>
       <w:pPr>
-        <w:pStyle w:val="ListParagraph"/>
-        <w:numPr>
-          <w:ilvl w:val="3"/>
-          <w:numId w:val="5"/>
-        </w:numPr>
         <w:spacing w:after="30"/>
         <w:rPr>
           <w:color w:val="0000FF"/>
@@ -4616,6 +5017,15 @@
           <w:szCs w:val="20"/>
           <w:highlight w:val="yellow"/>
         </w:rPr>
+        <w:t xml:space="preserve">a. </w:t>
+      </w:r>
+      <w:r>
+        <w:rPr>
+          <w:color w:val="0000FF"/>
+          <w:sz w:val="20"/>
+          <w:szCs w:val="20"/>
+          <w:highlight w:val="yellow"/>
+        </w:rPr>
         <w:t>N/A</w:t>
       </w:r>
     </w:p>
@@ -4646,7 +5056,27 @@
           <w:szCs w:val="20"/>
           <w:highlight w:val="yellow"/>
         </w:rPr>
-        <w:t>We were not able to make them work because:</w:t>
+        <w:t xml:space="preserve">We </w:t>
+      </w:r>
+      <w:proofErr w:type="gramStart"/>
+      <w:r>
+        <w:rPr>
+          <w:color w:val="0000FF"/>
+          <w:sz w:val="20"/>
+          <w:szCs w:val="20"/>
+          <w:highlight w:val="yellow"/>
+        </w:rPr>
+        <w:t>were not able to</w:t>
+      </w:r>
+      <w:proofErr w:type="gramEnd"/>
+      <w:r>
+        <w:rPr>
+          <w:color w:val="0000FF"/>
+          <w:sz w:val="20"/>
+          <w:szCs w:val="20"/>
+          <w:highlight w:val="yellow"/>
+        </w:rPr>
+        <w:t xml:space="preserve"> make them work because:</w:t>
       </w:r>
     </w:p>
     <w:p>
@@ -4758,7 +5188,16 @@
               <w:spacing w:after="30"/>
             </w:pPr>
             <w:r>
-              <w:t>1.  How did you implement your Graph data structure? Did you implement it using an Adjacency Matrix or Adjacency List or both? What is the reason behind your choice of graph data structure implementation? Explain briefly (at most 5 sentences).</w:t>
+              <w:lastRenderedPageBreak/>
+              <w:t>1</w:t>
+            </w:r>
+            <w:proofErr w:type="gramStart"/>
+            <w:r>
+              <w:t>.  How</w:t>
+            </w:r>
+            <w:proofErr w:type="gramEnd"/>
+            <w:r>
+              <w:t xml:space="preserve"> did you implement your Graph data structure? Did you implement it using an Adjacency Matrix or Adjacency List or both? What is the reason behind your choice of graph data structure implementation? Explain briefly (at most 5 sentences).</w:t>
             </w:r>
           </w:p>
           <w:p>
@@ -4777,7 +5216,21 @@
               <w:rPr>
                 <w:u w:val="single"/>
               </w:rPr>
-              <w:t>We chose to implement both Adjacency Matrix and List because of the unique requirements for both output functions. While the matrix requires the columns that represent each vertex be in the same order as its row counterpart, meanwhile the list requires to be in the same format as its input .txt file.</w:t>
+              <w:t xml:space="preserve">We chose to implement both Adjacency Matrix and List because of the unique requirements for both output functions. While the matrix requires the columns that represent each vertex </w:t>
+            </w:r>
+            <w:proofErr w:type="gramStart"/>
+            <w:r>
+              <w:rPr>
+                <w:u w:val="single"/>
+              </w:rPr>
+              <w:t>be</w:t>
+            </w:r>
+            <w:proofErr w:type="gramEnd"/>
+            <w:r>
+              <w:rPr>
+                <w:u w:val="single"/>
+              </w:rPr>
+              <w:t xml:space="preserve"> in the same order as its row counterpart, meanwhile the list requires to be in the same format as its input .txt file.</w:t>
             </w:r>
           </w:p>
           <w:p>
@@ -4938,7 +5391,27 @@
           <w:sz w:val="20"/>
           <w:szCs w:val="20"/>
         </w:rPr>
-        <w:t>VI.  SELF-EVALUATION</w:t>
+        <w:t>VI</w:t>
+      </w:r>
+      <w:proofErr w:type="gramStart"/>
+      <w:r>
+        <w:rPr>
+          <w:b/>
+          <w:bCs/>
+          <w:sz w:val="20"/>
+          <w:szCs w:val="20"/>
+        </w:rPr>
+        <w:t>.  SELF</w:t>
+      </w:r>
+      <w:proofErr w:type="gramEnd"/>
+      <w:r>
+        <w:rPr>
+          <w:b/>
+          <w:bCs/>
+          <w:sz w:val="20"/>
+          <w:szCs w:val="20"/>
+        </w:rPr>
+        <w:t>-EVALUATION</w:t>
       </w:r>
     </w:p>
     <w:p>
@@ -5167,7 +5640,23 @@
                 <w:sz w:val="20"/>
                 <w:szCs w:val="20"/>
               </w:rPr>
-              <w:t>     (max. 10 points)</w:t>
+              <w:t xml:space="preserve">  </w:t>
+            </w:r>
+            <w:proofErr w:type="gramStart"/>
+            <w:r>
+              <w:rPr>
+                <w:sz w:val="20"/>
+                <w:szCs w:val="20"/>
+              </w:rPr>
+              <w:t xml:space="preserve">   (</w:t>
+            </w:r>
+            <w:proofErr w:type="gramEnd"/>
+            <w:r>
+              <w:rPr>
+                <w:sz w:val="20"/>
+                <w:szCs w:val="20"/>
+              </w:rPr>
+              <w:t>max. 10 points)</w:t>
             </w:r>
           </w:p>
         </w:tc>
@@ -5198,7 +5687,15 @@
               <w:t xml:space="preserve">2. </w:t>
             </w:r>
             <w:r>
-              <w:t>Output Text File #2 (Vertices With Degrees)</w:t>
+              <w:t xml:space="preserve">Output Text File #2 (Vertices </w:t>
+            </w:r>
+            <w:proofErr w:type="gramStart"/>
+            <w:r>
+              <w:t>With</w:t>
+            </w:r>
+            <w:proofErr w:type="gramEnd"/>
+            <w:r>
+              <w:t xml:space="preserve"> Degrees)</w:t>
             </w:r>
           </w:p>
         </w:tc>
@@ -5250,7 +5747,23 @@
                 <w:sz w:val="20"/>
                 <w:szCs w:val="20"/>
               </w:rPr>
-              <w:t>     (max. 10 points)</w:t>
+              <w:t xml:space="preserve">  </w:t>
+            </w:r>
+            <w:proofErr w:type="gramStart"/>
+            <w:r>
+              <w:rPr>
+                <w:sz w:val="20"/>
+                <w:szCs w:val="20"/>
+              </w:rPr>
+              <w:t xml:space="preserve">   (</w:t>
+            </w:r>
+            <w:proofErr w:type="gramEnd"/>
+            <w:r>
+              <w:rPr>
+                <w:sz w:val="20"/>
+                <w:szCs w:val="20"/>
+              </w:rPr>
+              <w:t>max. 10 points)</w:t>
             </w:r>
           </w:p>
         </w:tc>
@@ -5332,7 +5845,23 @@
                 <w:sz w:val="20"/>
                 <w:szCs w:val="20"/>
               </w:rPr>
-              <w:t>     (max. 12.5 points)</w:t>
+              <w:t xml:space="preserve">  </w:t>
+            </w:r>
+            <w:proofErr w:type="gramStart"/>
+            <w:r>
+              <w:rPr>
+                <w:sz w:val="20"/>
+                <w:szCs w:val="20"/>
+              </w:rPr>
+              <w:t xml:space="preserve">   (</w:t>
+            </w:r>
+            <w:proofErr w:type="gramEnd"/>
+            <w:r>
+              <w:rPr>
+                <w:sz w:val="20"/>
+                <w:szCs w:val="20"/>
+              </w:rPr>
+              <w:t>max. 12.5 points)</w:t>
             </w:r>
           </w:p>
         </w:tc>
@@ -5412,7 +5941,23 @@
                 <w:sz w:val="20"/>
                 <w:szCs w:val="20"/>
               </w:rPr>
-              <w:t>     (max. 12.5 points)</w:t>
+              <w:t xml:space="preserve">  </w:t>
+            </w:r>
+            <w:proofErr w:type="gramStart"/>
+            <w:r>
+              <w:rPr>
+                <w:sz w:val="20"/>
+                <w:szCs w:val="20"/>
+              </w:rPr>
+              <w:t xml:space="preserve">   (</w:t>
+            </w:r>
+            <w:proofErr w:type="gramEnd"/>
+            <w:r>
+              <w:rPr>
+                <w:sz w:val="20"/>
+                <w:szCs w:val="20"/>
+              </w:rPr>
+              <w:t>max. 12.5 points)</w:t>
             </w:r>
           </w:p>
         </w:tc>
@@ -5494,7 +6039,23 @@
                 <w:sz w:val="20"/>
                 <w:szCs w:val="20"/>
               </w:rPr>
-              <w:t>     (max. 20 points)</w:t>
+              <w:t xml:space="preserve">  </w:t>
+            </w:r>
+            <w:proofErr w:type="gramStart"/>
+            <w:r>
+              <w:rPr>
+                <w:sz w:val="20"/>
+                <w:szCs w:val="20"/>
+              </w:rPr>
+              <w:t xml:space="preserve">   (</w:t>
+            </w:r>
+            <w:proofErr w:type="gramEnd"/>
+            <w:r>
+              <w:rPr>
+                <w:sz w:val="20"/>
+                <w:szCs w:val="20"/>
+              </w:rPr>
+              <w:t>max. 20 points)</w:t>
             </w:r>
           </w:p>
         </w:tc>
@@ -5576,7 +6137,23 @@
                 <w:sz w:val="20"/>
                 <w:szCs w:val="20"/>
               </w:rPr>
-              <w:t>     (max. 20 points)</w:t>
+              <w:t xml:space="preserve">  </w:t>
+            </w:r>
+            <w:proofErr w:type="gramStart"/>
+            <w:r>
+              <w:rPr>
+                <w:sz w:val="20"/>
+                <w:szCs w:val="20"/>
+              </w:rPr>
+              <w:t xml:space="preserve">   (</w:t>
+            </w:r>
+            <w:proofErr w:type="gramEnd"/>
+            <w:r>
+              <w:rPr>
+                <w:sz w:val="20"/>
+                <w:szCs w:val="20"/>
+              </w:rPr>
+              <w:t>max. 20 points)</w:t>
             </w:r>
           </w:p>
         </w:tc>
@@ -5658,7 +6235,23 @@
                 <w:sz w:val="20"/>
                 <w:szCs w:val="20"/>
               </w:rPr>
-              <w:t>     (max. 10 points)</w:t>
+              <w:t xml:space="preserve">  </w:t>
+            </w:r>
+            <w:proofErr w:type="gramStart"/>
+            <w:r>
+              <w:rPr>
+                <w:sz w:val="20"/>
+                <w:szCs w:val="20"/>
+              </w:rPr>
+              <w:t xml:space="preserve">   (</w:t>
+            </w:r>
+            <w:proofErr w:type="gramEnd"/>
+            <w:r>
+              <w:rPr>
+                <w:sz w:val="20"/>
+                <w:szCs w:val="20"/>
+              </w:rPr>
+              <w:t>max. 10 points)</w:t>
             </w:r>
           </w:p>
         </w:tc>
@@ -5740,7 +6333,23 @@
                 <w:sz w:val="20"/>
                 <w:szCs w:val="20"/>
               </w:rPr>
-              <w:t>     (max. 5 points)</w:t>
+              <w:t xml:space="preserve">  </w:t>
+            </w:r>
+            <w:proofErr w:type="gramStart"/>
+            <w:r>
+              <w:rPr>
+                <w:sz w:val="20"/>
+                <w:szCs w:val="20"/>
+              </w:rPr>
+              <w:t xml:space="preserve">   (</w:t>
+            </w:r>
+            <w:proofErr w:type="gramEnd"/>
+            <w:r>
+              <w:rPr>
+                <w:sz w:val="20"/>
+                <w:szCs w:val="20"/>
+              </w:rPr>
+              <w:t>max. 5 points)</w:t>
             </w:r>
           </w:p>
         </w:tc>
@@ -5828,7 +6437,23 @@
                 <w:sz w:val="20"/>
                 <w:szCs w:val="20"/>
               </w:rPr>
-              <w:t>     (max. 10 points)</w:t>
+              <w:t xml:space="preserve">  </w:t>
+            </w:r>
+            <w:proofErr w:type="gramStart"/>
+            <w:r>
+              <w:rPr>
+                <w:sz w:val="20"/>
+                <w:szCs w:val="20"/>
+              </w:rPr>
+              <w:t xml:space="preserve">   (</w:t>
+            </w:r>
+            <w:proofErr w:type="gramEnd"/>
+            <w:r>
+              <w:rPr>
+                <w:sz w:val="20"/>
+                <w:szCs w:val="20"/>
+              </w:rPr>
+              <w:t>max. 10 points)</w:t>
             </w:r>
           </w:p>
         </w:tc>
@@ -5936,6 +6561,7 @@
           <w:sz w:val="20"/>
           <w:szCs w:val="20"/>
         </w:rPr>
+        <w:lastRenderedPageBreak/>
         <w:t xml:space="preserve">NOTE: The evaluation that the instructor will give is not necessarily going to be the same as what you indicated above.  The self-assessment is for your own reference only… </w:t>
       </w:r>
     </w:p>
@@ -7251,6 +7877,7 @@
   <w:style w:type="character" w:default="1" w:styleId="DefaultParagraphFont">
     <w:name w:val="Default Paragraph Font"/>
     <w:uiPriority w:val="1"/>
+    <w:semiHidden/>
     <w:unhideWhenUsed/>
   </w:style>
   <w:style w:type="table" w:default="1" w:styleId="TableNormal">

</xml_diff>